<commit_message>
Refactored the webpage - Now the project portfolio item is removed. - Selected work first opens the collage and context, and then provides link to the paper - publications removed - Images uploaded for talks.
</commit_message>
<xml_diff>
--- a/content/resume.docx
+++ b/content/resume.docx
@@ -466,20 +466,18 @@
                 <w:szCs w:val="22"/>
                 <w14:ligatures w14:val="none"/>
               </w:rPr>
-              <w:t xml:space="preserve">Atmospheric scientist specializing in </w:t>
-            </w:r>
-            <w:r>
-              <w:rPr>
-                <w:rFonts w:ascii="Times New Roman" w:eastAsia="Gill Sans MT" w:hAnsi="Times New Roman" w:cs="Times New Roman"/>
-                <w:b/>
-                <w:bCs/>
+              <w:t xml:space="preserve">Atmospheric scientist and </w:t>
+            </w:r>
+            <w:r>
+              <w:rPr>
+                <w:rFonts w:ascii="Times New Roman" w:eastAsia="Gill Sans MT" w:hAnsi="Times New Roman" w:cs="Times New Roman"/>
                 <w:color w:val="000000"/>
                 <w:kern w:val="0"/>
                 <w:sz w:val="22"/>
                 <w:szCs w:val="22"/>
                 <w14:ligatures w14:val="none"/>
               </w:rPr>
-              <w:t>AI-driven weather prediction and numerical weather modeling</w:t>
+              <w:t>machine learning researcher</w:t>
             </w:r>
             <w:r>
               <w:rPr>
@@ -490,21 +488,21 @@
                 <w:szCs w:val="22"/>
                 <w14:ligatures w14:val="none"/>
               </w:rPr>
-              <w:t xml:space="preserve">, with expertise in </w:t>
-            </w:r>
-            <w:r>
-              <w:rPr>
-                <w:rFonts w:ascii="Times New Roman" w:eastAsia="Gill Sans MT" w:hAnsi="Times New Roman" w:cs="Times New Roman"/>
-                <w:b/>
-                <w:bCs/>
+              <w:t xml:space="preserve"> specializing in building and improving probabilistic weather forecast systems for extreme wind, precipitation, and renewable energy applications. Experienced in numerical weather prediction calibration, statistical post-processing, ensemble evaluation, and deep learning–based downscaling at grid-relevant spatial scales. Strong Python scientific computing background with extensive experience managing large, high-resolution atmospheric datasets using </w:t>
+            </w:r>
+            <w:proofErr w:type="spellStart"/>
+            <w:r>
+              <w:rPr>
+                <w:rFonts w:ascii="Times New Roman" w:eastAsia="Gill Sans MT" w:hAnsi="Times New Roman" w:cs="Times New Roman"/>
                 <w:color w:val="000000"/>
                 <w:kern w:val="0"/>
                 <w:sz w:val="22"/>
                 <w:szCs w:val="22"/>
                 <w14:ligatures w14:val="none"/>
               </w:rPr>
-              <w:t>WRF simulations, statistical post-processing, and deep learning architectures</w:t>
-            </w:r>
+              <w:t>Xarray</w:t>
+            </w:r>
+            <w:proofErr w:type="spellEnd"/>
             <w:r>
               <w:rPr>
                 <w:rFonts w:ascii="Times New Roman" w:eastAsia="Gill Sans MT" w:hAnsi="Times New Roman" w:cs="Times New Roman"/>
@@ -514,8 +512,9 @@
                 <w:szCs w:val="22"/>
                 <w14:ligatures w14:val="none"/>
               </w:rPr>
-              <w:t xml:space="preserve"> for extreme weather applications</w:t>
-            </w:r>
+              <w:t xml:space="preserve">, </w:t>
+            </w:r>
+            <w:proofErr w:type="spellStart"/>
             <w:r>
               <w:rPr>
                 <w:rFonts w:ascii="Times New Roman" w:eastAsia="Gill Sans MT" w:hAnsi="Times New Roman" w:cs="Times New Roman"/>
@@ -525,14 +524,133 @@
                 <w:szCs w:val="22"/>
                 <w14:ligatures w14:val="none"/>
               </w:rPr>
-              <w:t xml:space="preserve"> using </w:t>
+              <w:t>Dask</w:t>
+            </w:r>
+            <w:proofErr w:type="spellEnd"/>
+            <w:r>
+              <w:rPr>
+                <w:rFonts w:ascii="Times New Roman" w:eastAsia="Gill Sans MT" w:hAnsi="Times New Roman" w:cs="Times New Roman"/>
+                <w:color w:val="000000"/>
+                <w:kern w:val="0"/>
+                <w:sz w:val="22"/>
+                <w:szCs w:val="22"/>
+                <w14:ligatures w14:val="none"/>
+              </w:rPr>
+              <w:t>, and Zarr in multi-GPU HPC environments. Proven ability to translate atmospheric dynamics into operationally relevant wind and ramp risk insights.</w:t>
+            </w:r>
+          </w:p>
+        </w:tc>
+      </w:tr>
+      <w:tr>
+        <w:trPr>
+          <w:trHeight w:val="552"/>
+        </w:trPr>
+        <w:tc>
+          <w:tcPr>
+            <w:tcW w:w="9350" w:type="dxa"/>
+            <w:gridSpan w:val="5"/>
+            <w:tcBorders>
+              <w:top w:val="single" w:sz="24" w:space="0" w:color="4A57E0"/>
+            </w:tcBorders>
+          </w:tcPr>
+          <w:p>
+            <w:pPr>
+              <w:spacing w:after="200" w:line="240" w:lineRule="auto"/>
+              <w:rPr>
+                <w:rFonts w:ascii="Times New Roman" w:eastAsia="Gill Sans MT" w:hAnsi="Times New Roman" w:cs="Times New Roman"/>
+                <w:caps/>
+                <w:color w:val="172187"/>
+                <w:spacing w:val="20"/>
+                <w:kern w:val="0"/>
+                <w14:ligatures w14:val="none"/>
+              </w:rPr>
+            </w:pPr>
+            <w:r>
+              <w:rPr>
+                <w:rFonts w:ascii="Times New Roman" w:eastAsia="Gill Sans MT" w:hAnsi="Times New Roman" w:cs="Times New Roman"/>
+                <w:caps/>
+                <w:color w:val="172187"/>
+                <w:spacing w:val="20"/>
+                <w:kern w:val="0"/>
+                <w14:ligatures w14:val="none"/>
+              </w:rPr>
+              <w:t>Forecast System Development &amp; Uncertainty Modeling</w:t>
+            </w:r>
+          </w:p>
+        </w:tc>
+      </w:tr>
+      <w:tr>
+        <w:trPr>
+          <w:trHeight w:val="621"/>
+        </w:trPr>
+        <w:tc>
+          <w:tcPr>
+            <w:tcW w:w="9350" w:type="dxa"/>
+            <w:gridSpan w:val="5"/>
+          </w:tcPr>
+          <w:p>
+            <w:pPr>
+              <w:pStyle w:val="ListParagraph"/>
+              <w:numPr>
+                <w:ilvl w:val="0"/>
+                <w:numId w:val="9"/>
+              </w:numPr>
+              <w:spacing w:after="0" w:line="240" w:lineRule="auto"/>
+              <w:jc w:val="both"/>
+              <w:rPr>
+                <w:rFonts w:ascii="Times New Roman" w:eastAsia="Gill Sans MT" w:hAnsi="Times New Roman" w:cs="Times New Roman"/>
+                <w:color w:val="000000"/>
+                <w:kern w:val="0"/>
+                <w:sz w:val="22"/>
+                <w:szCs w:val="22"/>
+                <w14:ligatures w14:val="none"/>
+              </w:rPr>
+            </w:pPr>
+            <w:r>
+              <w:rPr>
+                <w:rFonts w:ascii="Times New Roman" w:eastAsia="Gill Sans MT" w:hAnsi="Times New Roman" w:cs="Times New Roman"/>
+                <w:color w:val="000000"/>
+                <w:kern w:val="0"/>
+                <w:sz w:val="22"/>
+                <w:szCs w:val="22"/>
+                <w14:ligatures w14:val="none"/>
+              </w:rPr>
+              <w:t>Developed and improved WRF forecast systems through sensitivity analysis, parameter calibration, and data assimilation to enhance tropical cyclone prediction skill.</w:t>
+            </w:r>
+          </w:p>
+          <w:p>
+            <w:pPr>
+              <w:pStyle w:val="ListParagraph"/>
+              <w:numPr>
+                <w:ilvl w:val="0"/>
+                <w:numId w:val="9"/>
+              </w:numPr>
+              <w:spacing w:after="0" w:line="240" w:lineRule="auto"/>
+              <w:jc w:val="both"/>
+              <w:rPr>
+                <w:rFonts w:ascii="Times New Roman" w:eastAsia="Gill Sans MT" w:hAnsi="Times New Roman" w:cs="Times New Roman"/>
+                <w:color w:val="000000"/>
+                <w:kern w:val="0"/>
+                <w:sz w:val="22"/>
+                <w:szCs w:val="22"/>
+                <w14:ligatures w14:val="none"/>
+              </w:rPr>
+            </w:pPr>
+            <w:r>
+              <w:rPr>
+                <w:rFonts w:ascii="Times New Roman" w:eastAsia="Gill Sans MT" w:hAnsi="Times New Roman" w:cs="Times New Roman"/>
+                <w:color w:val="000000"/>
+                <w:kern w:val="0"/>
+                <w:sz w:val="22"/>
+                <w:szCs w:val="22"/>
+                <w14:ligatures w14:val="none"/>
+              </w:rPr>
+              <w:t xml:space="preserve">Designed deep learning frameworks for wind gust nowcasting and high-resolution wind field reconstruction from sparse </w:t>
             </w:r>
             <w:proofErr w:type="spellStart"/>
             <w:r>
               <w:rPr>
                 <w:rFonts w:ascii="Times New Roman" w:eastAsia="Gill Sans MT" w:hAnsi="Times New Roman" w:cs="Times New Roman"/>
-                <w:b/>
-                <w:bCs/>
                 <w:color w:val="000000"/>
                 <w:kern w:val="0"/>
                 <w:sz w:val="22"/>
@@ -551,9 +669,18 @@
                 <w:szCs w:val="22"/>
                 <w14:ligatures w14:val="none"/>
               </w:rPr>
-              <w:t xml:space="preserve"> observations</w:t>
-            </w:r>
-            <w:r>
+              <w:t xml:space="preserve"> observations.</w:t>
+            </w:r>
+          </w:p>
+          <w:p>
+            <w:pPr>
+              <w:pStyle w:val="ListParagraph"/>
+              <w:numPr>
+                <w:ilvl w:val="0"/>
+                <w:numId w:val="9"/>
+              </w:numPr>
+              <w:spacing w:after="0" w:line="240" w:lineRule="auto"/>
+              <w:jc w:val="both"/>
               <w:rPr>
                 <w:rFonts w:ascii="Times New Roman" w:eastAsia="Gill Sans MT" w:hAnsi="Times New Roman" w:cs="Times New Roman"/>
                 <w:color w:val="000000"/>
@@ -562,21 +689,19 @@
                 <w:szCs w:val="22"/>
                 <w14:ligatures w14:val="none"/>
               </w:rPr>
-              <w:t xml:space="preserve">. Developed and published </w:t>
-            </w:r>
-            <w:r>
-              <w:rPr>
-                <w:rFonts w:ascii="Times New Roman" w:eastAsia="Gill Sans MT" w:hAnsi="Times New Roman" w:cs="Times New Roman"/>
-                <w:b/>
-                <w:bCs/>
+            </w:pPr>
+            <w:r>
+              <w:rPr>
+                <w:rFonts w:ascii="Times New Roman" w:eastAsia="Gill Sans MT" w:hAnsi="Times New Roman" w:cs="Times New Roman"/>
                 <w:color w:val="000000"/>
                 <w:kern w:val="0"/>
                 <w:sz w:val="22"/>
                 <w:szCs w:val="22"/>
                 <w14:ligatures w14:val="none"/>
               </w:rPr>
-              <w:t>novel ML frameworks</w:t>
-            </w:r>
+              <w:t>Built attention-based U-Net architectures for precipitation forecasting under spatiotemporal shifts (</w:t>
+            </w:r>
+            <w:proofErr w:type="spellStart"/>
             <w:r>
               <w:rPr>
                 <w:rFonts w:ascii="Times New Roman" w:eastAsia="Gill Sans MT" w:hAnsi="Times New Roman" w:cs="Times New Roman"/>
@@ -586,22 +711,30 @@
                 <w:szCs w:val="22"/>
                 <w14:ligatures w14:val="none"/>
               </w:rPr>
-              <w:t xml:space="preserve"> for wind gust nowcasting</w:t>
-            </w:r>
-            <w:r>
-              <w:rPr>
-                <w:rFonts w:ascii="Times New Roman" w:eastAsia="Gill Sans MT" w:hAnsi="Times New Roman" w:cs="Times New Roman"/>
-                <w:b/>
-                <w:bCs/>
+              <w:t>NeurIPS</w:t>
+            </w:r>
+            <w:proofErr w:type="spellEnd"/>
+            <w:r>
+              <w:rPr>
+                <w:rFonts w:ascii="Times New Roman" w:eastAsia="Gill Sans MT" w:hAnsi="Times New Roman" w:cs="Times New Roman"/>
                 <w:color w:val="000000"/>
                 <w:kern w:val="0"/>
                 <w:sz w:val="22"/>
                 <w:szCs w:val="22"/>
                 <w14:ligatures w14:val="none"/>
               </w:rPr>
-              <w:t>, precipitation forecasting, and vertical wind profile estimation</w:t>
-            </w:r>
-            <w:r>
+              <w:t xml:space="preserve"> Weather4Cast, 4th place).</w:t>
+            </w:r>
+          </w:p>
+          <w:p>
+            <w:pPr>
+              <w:pStyle w:val="ListParagraph"/>
+              <w:numPr>
+                <w:ilvl w:val="0"/>
+                <w:numId w:val="9"/>
+              </w:numPr>
+              <w:spacing w:after="0" w:line="240" w:lineRule="auto"/>
+              <w:jc w:val="both"/>
               <w:rPr>
                 <w:rFonts w:ascii="Times New Roman" w:eastAsia="Gill Sans MT" w:hAnsi="Times New Roman" w:cs="Times New Roman"/>
                 <w:color w:val="000000"/>
@@ -610,22 +743,28 @@
                 <w:szCs w:val="22"/>
                 <w14:ligatures w14:val="none"/>
               </w:rPr>
-              <w:t xml:space="preserve"> using datasets such as </w:t>
-            </w:r>
-            <w:r>
-              <w:rPr>
-                <w:rFonts w:ascii="Times New Roman" w:eastAsia="Gill Sans MT" w:hAnsi="Times New Roman" w:cs="Times New Roman"/>
-                <w:b/>
-                <w:bCs/>
+            </w:pPr>
+            <w:r>
+              <w:rPr>
+                <w:rFonts w:ascii="Times New Roman" w:eastAsia="Gill Sans MT" w:hAnsi="Times New Roman" w:cs="Times New Roman"/>
                 <w:color w:val="000000"/>
                 <w:kern w:val="0"/>
                 <w:sz w:val="22"/>
                 <w:szCs w:val="22"/>
                 <w14:ligatures w14:val="none"/>
               </w:rPr>
-              <w:t>ERA5, CERRA, NOW23, and lidar profiler observations</w:t>
-            </w:r>
-            <w:r>
+              <w:t>Lead development of a multi-model deep learning ensemble for downscaling global and regional climate products to 2.5 km resolution using U-Net variants, attention-based transformers, and GANs, integrating ERA5, CONUS404, EDDEv2, URMA, and ICON datasets.</w:t>
+            </w:r>
+          </w:p>
+          <w:p>
+            <w:pPr>
+              <w:pStyle w:val="ListParagraph"/>
+              <w:numPr>
+                <w:ilvl w:val="0"/>
+                <w:numId w:val="9"/>
+              </w:numPr>
+              <w:spacing w:after="0" w:line="240" w:lineRule="auto"/>
+              <w:jc w:val="both"/>
               <w:rPr>
                 <w:rFonts w:ascii="Times New Roman" w:eastAsia="Gill Sans MT" w:hAnsi="Times New Roman" w:cs="Times New Roman"/>
                 <w:color w:val="000000"/>
@@ -634,107 +773,47 @@
                 <w:szCs w:val="22"/>
                 <w14:ligatures w14:val="none"/>
               </w:rPr>
-              <w:t xml:space="preserve">. Proficient in </w:t>
-            </w:r>
-            <w:r>
-              <w:rPr>
-                <w:rFonts w:ascii="Times New Roman" w:eastAsia="Gill Sans MT" w:hAnsi="Times New Roman" w:cs="Times New Roman"/>
-                <w:b/>
-                <w:bCs/>
+            </w:pPr>
+            <w:r>
+              <w:rPr>
+                <w:rFonts w:ascii="Times New Roman" w:eastAsia="Gill Sans MT" w:hAnsi="Times New Roman" w:cs="Times New Roman"/>
                 <w:color w:val="000000"/>
                 <w:kern w:val="0"/>
                 <w:sz w:val="22"/>
                 <w:szCs w:val="22"/>
                 <w14:ligatures w14:val="none"/>
               </w:rPr>
-              <w:t xml:space="preserve">TensorFlow, </w:t>
-            </w:r>
-            <w:proofErr w:type="spellStart"/>
-            <w:r>
-              <w:rPr>
-                <w:rFonts w:ascii="Times New Roman" w:eastAsia="Gill Sans MT" w:hAnsi="Times New Roman" w:cs="Times New Roman"/>
-                <w:b/>
-                <w:bCs/>
+              <w:t>Designed ensemble-based evaluation strategies to assess calibration, spatial coherence, extreme event representation, and ramp behavior.</w:t>
+            </w:r>
+          </w:p>
+          <w:p>
+            <w:pPr>
+              <w:pStyle w:val="ListParagraph"/>
+              <w:numPr>
+                <w:ilvl w:val="0"/>
+                <w:numId w:val="9"/>
+              </w:numPr>
+              <w:spacing w:after="0" w:line="240" w:lineRule="auto"/>
+              <w:jc w:val="both"/>
+              <w:rPr>
+                <w:rFonts w:ascii="Times New Roman" w:eastAsia="Gill Sans MT" w:hAnsi="Times New Roman" w:cs="Times New Roman"/>
                 <w:color w:val="000000"/>
                 <w:kern w:val="0"/>
                 <w:sz w:val="22"/>
                 <w:szCs w:val="22"/>
                 <w14:ligatures w14:val="none"/>
               </w:rPr>
-              <w:t>PyTorch</w:t>
-            </w:r>
-            <w:proofErr w:type="spellEnd"/>
-            <w:r>
-              <w:rPr>
-                <w:rFonts w:ascii="Times New Roman" w:eastAsia="Gill Sans MT" w:hAnsi="Times New Roman" w:cs="Times New Roman"/>
-                <w:b/>
-                <w:bCs/>
+            </w:pPr>
+            <w:r>
+              <w:rPr>
+                <w:rFonts w:ascii="Times New Roman" w:eastAsia="Gill Sans MT" w:hAnsi="Times New Roman" w:cs="Times New Roman"/>
                 <w:color w:val="000000"/>
                 <w:kern w:val="0"/>
                 <w:sz w:val="22"/>
                 <w:szCs w:val="22"/>
                 <w14:ligatures w14:val="none"/>
               </w:rPr>
-              <w:t>, Scikit-Learn</w:t>
-            </w:r>
-            <w:r>
-              <w:rPr>
-                <w:rFonts w:ascii="Times New Roman" w:eastAsia="Gill Sans MT" w:hAnsi="Times New Roman" w:cs="Times New Roman"/>
-                <w:color w:val="000000"/>
-                <w:kern w:val="0"/>
-                <w:sz w:val="22"/>
-                <w:szCs w:val="22"/>
-                <w14:ligatures w14:val="none"/>
-              </w:rPr>
-              <w:t xml:space="preserve">, and advanced </w:t>
-            </w:r>
-            <w:r>
-              <w:rPr>
-                <w:rFonts w:ascii="Times New Roman" w:eastAsia="Gill Sans MT" w:hAnsi="Times New Roman" w:cs="Times New Roman"/>
-                <w:b/>
-                <w:bCs/>
-                <w:color w:val="000000"/>
-                <w:kern w:val="0"/>
-                <w:sz w:val="22"/>
-                <w:szCs w:val="22"/>
-                <w14:ligatures w14:val="none"/>
-              </w:rPr>
-              <w:t>HPC workflows</w:t>
-            </w:r>
-            <w:r>
-              <w:rPr>
-                <w:rFonts w:ascii="Times New Roman" w:eastAsia="Gill Sans MT" w:hAnsi="Times New Roman" w:cs="Times New Roman"/>
-                <w:color w:val="000000"/>
-                <w:kern w:val="0"/>
-                <w:sz w:val="22"/>
-                <w:szCs w:val="22"/>
-                <w14:ligatures w14:val="none"/>
-              </w:rPr>
-              <w:t xml:space="preserve">, with transferable skills for cloud environments. Strong record of </w:t>
-            </w:r>
-            <w:r>
-              <w:rPr>
-                <w:rFonts w:ascii="Times New Roman" w:eastAsia="Gill Sans MT" w:hAnsi="Times New Roman" w:cs="Times New Roman"/>
-                <w:b/>
-                <w:bCs/>
-                <w:color w:val="000000"/>
-                <w:kern w:val="0"/>
-                <w:sz w:val="22"/>
-                <w:szCs w:val="22"/>
-                <w14:ligatures w14:val="none"/>
-              </w:rPr>
-              <w:t>peer-reviewed publications, international conference presentations, and collaborative projects</w:t>
-            </w:r>
-            <w:r>
-              <w:rPr>
-                <w:rFonts w:ascii="Times New Roman" w:eastAsia="Gill Sans MT" w:hAnsi="Times New Roman" w:cs="Times New Roman"/>
-                <w:color w:val="000000"/>
-                <w:kern w:val="0"/>
-                <w:sz w:val="22"/>
-                <w:szCs w:val="22"/>
-                <w14:ligatures w14:val="none"/>
-              </w:rPr>
-              <w:t>, demonstrating ability to work independently while contributing to large-scale research efforts.</w:t>
+              <w:t>Applied Gaussian Process Regression and Bayesian optimization for uncertainty quantification and model calibration.</w:t>
             </w:r>
           </w:p>
         </w:tc>
@@ -781,6 +860,7 @@
                 <w:showingPlcHdr/>
                 <w15:appearance w15:val="hidden"/>
               </w:sdtPr>
+              <w:sdtEndPr/>
               <w:sdtContent>
                 <w:r>
                   <w:rPr>
@@ -1232,6 +1312,7 @@
                 <w:showingPlcHdr/>
                 <w15:appearance w15:val="hidden"/>
               </w:sdtPr>
+              <w:sdtEndPr/>
               <w:sdtContent>
                 <w:r>
                   <w:rPr>
@@ -1437,43 +1518,55 @@
       <w:tr>
         <w:tc>
           <w:tcPr>
-            <w:tcW w:w="6389" w:type="dxa"/>
-            <w:gridSpan w:val="3"/>
+            <w:tcW w:w="9350" w:type="dxa"/>
+            <w:gridSpan w:val="5"/>
           </w:tcPr>
           <w:p>
             <w:pPr>
+              <w:pStyle w:val="ListParagraph"/>
               <w:keepNext/>
               <w:keepLines/>
+              <w:numPr>
+                <w:ilvl w:val="0"/>
+                <w:numId w:val="10"/>
+              </w:numPr>
               <w:spacing w:after="120" w:line="240" w:lineRule="auto"/>
+              <w:jc w:val="both"/>
               <w:outlineLvl w:val="1"/>
               <w:rPr>
                 <w:rFonts w:ascii="Times New Roman" w:eastAsia="Times New Roman" w:hAnsi="Times New Roman" w:cs="Times New Roman"/>
-                <w:b/>
-                <w:color w:val="404040"/>
-                <w:kern w:val="0"/>
-                <w:sz w:val="22"/>
-                <w:szCs w:val="22"/>
-                <w14:ligatures w14:val="none"/>
-              </w:rPr>
-            </w:pPr>
-            <w:r>
-              <w:rPr>
-                <w:rFonts w:ascii="Times New Roman" w:eastAsia="Times New Roman" w:hAnsi="Times New Roman" w:cs="Times New Roman"/>
-                <w:b/>
-                <w:color w:val="404040"/>
-                <w:kern w:val="0"/>
-                <w:sz w:val="22"/>
-                <w:szCs w:val="22"/>
-                <w14:ligatures w14:val="none"/>
-              </w:rPr>
-              <w:t>Technical University of Delft</w:t>
-            </w:r>
-          </w:p>
-          <w:p>
-            <w:pPr>
+                <w:bCs/>
+                <w:color w:val="404040"/>
+                <w:kern w:val="0"/>
+                <w:sz w:val="22"/>
+                <w:szCs w:val="22"/>
+                <w14:ligatures w14:val="none"/>
+              </w:rPr>
+            </w:pPr>
+            <w:r>
+              <w:rPr>
+                <w:rFonts w:ascii="Times New Roman" w:eastAsia="Times New Roman" w:hAnsi="Times New Roman" w:cs="Times New Roman"/>
+                <w:bCs/>
+                <w:color w:val="404040"/>
+                <w:kern w:val="0"/>
+                <w:sz w:val="22"/>
+                <w:szCs w:val="22"/>
+                <w14:ligatures w14:val="none"/>
+              </w:rPr>
+              <w:t>Lead development of deep learning ensemble for 2.5 km downscaling of future climate and reanalysis products.</w:t>
+            </w:r>
+          </w:p>
+          <w:p>
+            <w:pPr>
+              <w:pStyle w:val="ListParagraph"/>
               <w:keepNext/>
               <w:keepLines/>
+              <w:numPr>
+                <w:ilvl w:val="0"/>
+                <w:numId w:val="10"/>
+              </w:numPr>
               <w:spacing w:after="120" w:line="240" w:lineRule="auto"/>
+              <w:jc w:val="both"/>
               <w:outlineLvl w:val="1"/>
               <w:rPr>
                 <w:rFonts w:ascii="Times New Roman" w:eastAsia="Times New Roman" w:hAnsi="Times New Roman" w:cs="Times New Roman"/>
@@ -1495,14 +1588,73 @@
                 <w:szCs w:val="22"/>
                 <w14:ligatures w14:val="none"/>
               </w:rPr>
-              <w:t>Postdoctoral Researcher</w:t>
-            </w:r>
-          </w:p>
-          <w:p>
-            <w:pPr>
+              <w:lastRenderedPageBreak/>
+              <w:t xml:space="preserve">Built gust nowcasting system from sparse </w:t>
+            </w:r>
+            <w:proofErr w:type="spellStart"/>
+            <w:r>
+              <w:rPr>
+                <w:rFonts w:ascii="Times New Roman" w:eastAsia="Times New Roman" w:hAnsi="Times New Roman" w:cs="Times New Roman"/>
+                <w:bCs/>
+                <w:color w:val="404040"/>
+                <w:kern w:val="0"/>
+                <w:sz w:val="22"/>
+                <w:szCs w:val="22"/>
+                <w14:ligatures w14:val="none"/>
+              </w:rPr>
+              <w:t>Mesonet</w:t>
+            </w:r>
+            <w:proofErr w:type="spellEnd"/>
+            <w:r>
+              <w:rPr>
+                <w:rFonts w:ascii="Times New Roman" w:eastAsia="Times New Roman" w:hAnsi="Times New Roman" w:cs="Times New Roman"/>
+                <w:bCs/>
+                <w:color w:val="404040"/>
+                <w:kern w:val="0"/>
+                <w:sz w:val="22"/>
+                <w:szCs w:val="22"/>
+                <w14:ligatures w14:val="none"/>
+              </w:rPr>
+              <w:t xml:space="preserve"> observations using </w:t>
+            </w:r>
+            <w:proofErr w:type="spellStart"/>
+            <w:r>
+              <w:rPr>
+                <w:rFonts w:ascii="Times New Roman" w:eastAsia="Times New Roman" w:hAnsi="Times New Roman" w:cs="Times New Roman"/>
+                <w:bCs/>
+                <w:color w:val="404040"/>
+                <w:kern w:val="0"/>
+                <w:sz w:val="22"/>
+                <w:szCs w:val="22"/>
+                <w14:ligatures w14:val="none"/>
+              </w:rPr>
+              <w:t>PyTorch</w:t>
+            </w:r>
+            <w:proofErr w:type="spellEnd"/>
+            <w:r>
+              <w:rPr>
+                <w:rFonts w:ascii="Times New Roman" w:eastAsia="Times New Roman" w:hAnsi="Times New Roman" w:cs="Times New Roman"/>
+                <w:bCs/>
+                <w:color w:val="404040"/>
+                <w:kern w:val="0"/>
+                <w:sz w:val="22"/>
+                <w:szCs w:val="22"/>
+                <w14:ligatures w14:val="none"/>
+              </w:rPr>
+              <w:t>-based architectures.</w:t>
+            </w:r>
+          </w:p>
+          <w:p>
+            <w:pPr>
+              <w:pStyle w:val="ListParagraph"/>
               <w:keepNext/>
               <w:keepLines/>
+              <w:numPr>
+                <w:ilvl w:val="0"/>
+                <w:numId w:val="10"/>
+              </w:numPr>
               <w:spacing w:after="120" w:line="240" w:lineRule="auto"/>
+              <w:jc w:val="both"/>
               <w:outlineLvl w:val="1"/>
               <w:rPr>
                 <w:rFonts w:ascii="Times New Roman" w:eastAsia="Times New Roman" w:hAnsi="Times New Roman" w:cs="Times New Roman"/>
@@ -1524,126 +1676,7 @@
                 <w:szCs w:val="22"/>
                 <w14:ligatures w14:val="none"/>
               </w:rPr>
-              <w:t>Department of Geosciences and Remote Sensing</w:t>
-            </w:r>
-          </w:p>
-          <w:p>
-            <w:pPr>
-              <w:keepNext/>
-              <w:keepLines/>
-              <w:spacing w:after="120" w:line="240" w:lineRule="auto"/>
-              <w:outlineLvl w:val="1"/>
-              <w:rPr>
-                <w:rFonts w:ascii="Times New Roman" w:eastAsia="Times New Roman" w:hAnsi="Times New Roman" w:cs="Times New Roman"/>
-                <w:bCs/>
-                <w:color w:val="404040"/>
-                <w:kern w:val="0"/>
-                <w:sz w:val="22"/>
-                <w:szCs w:val="22"/>
-                <w14:ligatures w14:val="none"/>
-              </w:rPr>
-            </w:pPr>
-            <w:r>
-              <w:rPr>
-                <w:rFonts w:ascii="Times New Roman" w:eastAsia="Times New Roman" w:hAnsi="Times New Roman" w:cs="Times New Roman"/>
-                <w:bCs/>
-                <w:color w:val="404040"/>
-                <w:kern w:val="0"/>
-                <w:sz w:val="22"/>
-                <w:szCs w:val="22"/>
-                <w14:ligatures w14:val="none"/>
-              </w:rPr>
-              <w:t>Faculty of Civil Engineering and Geosciences</w:t>
-            </w:r>
-          </w:p>
-        </w:tc>
-        <w:tc>
-          <w:tcPr>
-            <w:tcW w:w="2961" w:type="dxa"/>
-            <w:gridSpan w:val="2"/>
-          </w:tcPr>
-          <w:p>
-            <w:pPr>
-              <w:keepNext/>
-              <w:keepLines/>
-              <w:spacing w:after="120" w:line="240" w:lineRule="auto"/>
-              <w:jc w:val="right"/>
-              <w:outlineLvl w:val="1"/>
-              <w:rPr>
-                <w:rFonts w:ascii="Times New Roman" w:eastAsia="Times New Roman" w:hAnsi="Times New Roman" w:cs="Times New Roman"/>
-                <w:bCs/>
-                <w:color w:val="404040"/>
-                <w:kern w:val="0"/>
-                <w:sz w:val="22"/>
-                <w:szCs w:val="22"/>
-                <w14:ligatures w14:val="none"/>
-              </w:rPr>
-            </w:pPr>
-            <w:r>
-              <w:rPr>
-                <w:rFonts w:ascii="Times New Roman" w:eastAsia="Times New Roman" w:hAnsi="Times New Roman" w:cs="Times New Roman"/>
-                <w:bCs/>
-                <w:color w:val="404040"/>
-                <w:kern w:val="0"/>
-                <w:sz w:val="22"/>
-                <w:szCs w:val="22"/>
-                <w14:ligatures w14:val="none"/>
-              </w:rPr>
-              <w:t>Delft, The Netherlands</w:t>
-            </w:r>
-          </w:p>
-          <w:p>
-            <w:pPr>
-              <w:keepNext/>
-              <w:keepLines/>
-              <w:spacing w:after="120" w:line="240" w:lineRule="auto"/>
-              <w:jc w:val="right"/>
-              <w:outlineLvl w:val="1"/>
-              <w:rPr>
-                <w:rFonts w:ascii="Times New Roman" w:eastAsia="Times New Roman" w:hAnsi="Times New Roman" w:cs="Times New Roman"/>
-                <w:bCs/>
-                <w:color w:val="404040"/>
-                <w:kern w:val="0"/>
-                <w:sz w:val="22"/>
-                <w:szCs w:val="22"/>
-                <w14:ligatures w14:val="none"/>
-              </w:rPr>
-            </w:pPr>
-            <w:r>
-              <w:rPr>
-                <w:rFonts w:ascii="Times New Roman" w:eastAsia="Times New Roman" w:hAnsi="Times New Roman" w:cs="Times New Roman"/>
-                <w:bCs/>
-                <w:color w:val="404040"/>
-                <w:kern w:val="0"/>
-                <w:sz w:val="22"/>
-                <w:szCs w:val="22"/>
-                <w14:ligatures w14:val="none"/>
-              </w:rPr>
-              <w:t>September 2022 -</w:t>
-            </w:r>
-            <w:r>
-              <w:rPr>
-                <w:rFonts w:ascii="Times New Roman" w:eastAsia="Times New Roman" w:hAnsi="Times New Roman" w:cs="Times New Roman"/>
-                <w:bCs/>
-                <w:color w:val="404040"/>
-                <w:kern w:val="0"/>
-                <w:sz w:val="22"/>
-                <w:szCs w:val="22"/>
-                <w14:ligatures w14:val="none"/>
-              </w:rPr>
-              <w:t>August 2024</w:t>
-            </w:r>
-            <w:r>
-              <w:rPr>
-                <w:rFonts w:ascii="Times New Roman" w:eastAsia="Times New Roman" w:hAnsi="Times New Roman" w:cs="Times New Roman"/>
-                <w:bCs/>
-                <w:color w:val="404040"/>
-                <w:kern w:val="0"/>
-                <w:sz w:val="22"/>
-                <w:szCs w:val="22"/>
-                <w14:ligatures w14:val="none"/>
-              </w:rPr>
-              <w:t xml:space="preserve"> </w:t>
+              <w:t>Designed benchmarking pipelines to evaluate extreme wind and ramp prediction performance.</w:t>
             </w:r>
           </w:p>
         </w:tc>
@@ -1680,7 +1713,8 @@
                 <w:szCs w:val="22"/>
                 <w14:ligatures w14:val="none"/>
               </w:rPr>
-              <w:t>Indian Institute of Technology Madras</w:t>
+              <w:lastRenderedPageBreak/>
+              <w:t>Technical University of Delft</w:t>
             </w:r>
           </w:p>
           <w:p>
@@ -1688,6 +1722,7 @@
               <w:keepNext/>
               <w:keepLines/>
               <w:spacing w:after="120" w:line="240" w:lineRule="auto"/>
+              <w:jc w:val="both"/>
               <w:outlineLvl w:val="1"/>
               <w:rPr>
                 <w:rFonts w:ascii="Times New Roman" w:eastAsia="Times New Roman" w:hAnsi="Times New Roman" w:cs="Times New Roman"/>
@@ -1709,7 +1744,67 @@
                 <w:szCs w:val="22"/>
                 <w14:ligatures w14:val="none"/>
               </w:rPr>
-              <w:t>Institute Postdoctoral Equivalent Fellowship</w:t>
+              <w:t>Postdoctoral Researcher</w:t>
+            </w:r>
+          </w:p>
+          <w:p>
+            <w:pPr>
+              <w:keepNext/>
+              <w:keepLines/>
+              <w:spacing w:after="120" w:line="240" w:lineRule="auto"/>
+              <w:jc w:val="both"/>
+              <w:outlineLvl w:val="1"/>
+              <w:rPr>
+                <w:rFonts w:ascii="Times New Roman" w:eastAsia="Times New Roman" w:hAnsi="Times New Roman" w:cs="Times New Roman"/>
+                <w:bCs/>
+                <w:color w:val="404040"/>
+                <w:kern w:val="0"/>
+                <w:sz w:val="22"/>
+                <w:szCs w:val="22"/>
+                <w14:ligatures w14:val="none"/>
+              </w:rPr>
+            </w:pPr>
+            <w:r>
+              <w:rPr>
+                <w:rFonts w:ascii="Times New Roman" w:eastAsia="Times New Roman" w:hAnsi="Times New Roman" w:cs="Times New Roman"/>
+                <w:bCs/>
+                <w:color w:val="404040"/>
+                <w:kern w:val="0"/>
+                <w:sz w:val="22"/>
+                <w:szCs w:val="22"/>
+                <w14:ligatures w14:val="none"/>
+              </w:rPr>
+              <w:t>Department of Geosciences and Remote Sensing</w:t>
+            </w:r>
+          </w:p>
+          <w:p>
+            <w:pPr>
+              <w:keepNext/>
+              <w:keepLines/>
+              <w:spacing w:after="120" w:line="240" w:lineRule="auto"/>
+              <w:jc w:val="both"/>
+              <w:outlineLvl w:val="1"/>
+              <w:rPr>
+                <w:rFonts w:ascii="Times New Roman" w:eastAsia="Times New Roman" w:hAnsi="Times New Roman" w:cs="Times New Roman"/>
+                <w:bCs/>
+                <w:color w:val="404040"/>
+                <w:kern w:val="0"/>
+                <w:sz w:val="22"/>
+                <w:szCs w:val="22"/>
+                <w14:ligatures w14:val="none"/>
+              </w:rPr>
+            </w:pPr>
+            <w:r>
+              <w:rPr>
+                <w:rFonts w:ascii="Times New Roman" w:eastAsia="Times New Roman" w:hAnsi="Times New Roman" w:cs="Times New Roman"/>
+                <w:bCs/>
+                <w:color w:val="404040"/>
+                <w:kern w:val="0"/>
+                <w:sz w:val="22"/>
+                <w:szCs w:val="22"/>
+                <w14:ligatures w14:val="none"/>
+              </w:rPr>
+              <w:t>Faculty of Civil Engineering and Geosciences</w:t>
             </w:r>
           </w:p>
         </w:tc>
@@ -1745,7 +1840,7 @@
                 <w:szCs w:val="22"/>
                 <w14:ligatures w14:val="none"/>
               </w:rPr>
-              <w:t>Chennai, Tamil Nadu, India</w:t>
+              <w:t>Delft, The Netherlands</w:t>
             </w:r>
           </w:p>
           <w:p>
@@ -1775,6 +1870,336 @@
                 <w:szCs w:val="22"/>
                 <w14:ligatures w14:val="none"/>
               </w:rPr>
+              <w:t>September 2022 -</w:t>
+            </w:r>
+            <w:r>
+              <w:rPr>
+                <w:rFonts w:ascii="Times New Roman" w:eastAsia="Times New Roman" w:hAnsi="Times New Roman" w:cs="Times New Roman"/>
+                <w:bCs/>
+                <w:color w:val="404040"/>
+                <w:kern w:val="0"/>
+                <w:sz w:val="22"/>
+                <w:szCs w:val="22"/>
+                <w14:ligatures w14:val="none"/>
+              </w:rPr>
+              <w:t>August 2024</w:t>
+            </w:r>
+            <w:r>
+              <w:rPr>
+                <w:rFonts w:ascii="Times New Roman" w:eastAsia="Times New Roman" w:hAnsi="Times New Roman" w:cs="Times New Roman"/>
+                <w:bCs/>
+                <w:color w:val="404040"/>
+                <w:kern w:val="0"/>
+                <w:sz w:val="22"/>
+                <w:szCs w:val="22"/>
+                <w14:ligatures w14:val="none"/>
+              </w:rPr>
+              <w:t xml:space="preserve"> </w:t>
+            </w:r>
+          </w:p>
+        </w:tc>
+      </w:tr>
+      <w:tr>
+        <w:tc>
+          <w:tcPr>
+            <w:tcW w:w="9350" w:type="dxa"/>
+            <w:gridSpan w:val="5"/>
+          </w:tcPr>
+          <w:p>
+            <w:pPr>
+              <w:pStyle w:val="ListParagraph"/>
+              <w:keepNext/>
+              <w:keepLines/>
+              <w:numPr>
+                <w:ilvl w:val="0"/>
+                <w:numId w:val="10"/>
+              </w:numPr>
+              <w:spacing w:after="120" w:line="240" w:lineRule="auto"/>
+              <w:jc w:val="both"/>
+              <w:outlineLvl w:val="1"/>
+              <w:rPr>
+                <w:rFonts w:ascii="Times New Roman" w:eastAsia="Times New Roman" w:hAnsi="Times New Roman" w:cs="Times New Roman"/>
+                <w:bCs/>
+                <w:color w:val="404040"/>
+                <w:kern w:val="0"/>
+                <w:sz w:val="22"/>
+                <w:szCs w:val="22"/>
+                <w14:ligatures w14:val="none"/>
+              </w:rPr>
+            </w:pPr>
+            <w:r>
+              <w:rPr>
+                <w:rFonts w:ascii="Times New Roman" w:eastAsia="Times New Roman" w:hAnsi="Times New Roman" w:cs="Times New Roman"/>
+                <w:bCs/>
+                <w:color w:val="404040"/>
+                <w:kern w:val="0"/>
+                <w:sz w:val="22"/>
+                <w:szCs w:val="22"/>
+                <w14:ligatures w14:val="none"/>
+              </w:rPr>
+              <w:t>Led development of high-resolution (500 m) offshore wind and solar resource assessments using the Weather Research and Forecasting (WRF) model to generate grid-relevant wind fields for renewable energy planning.</w:t>
+            </w:r>
+          </w:p>
+          <w:p>
+            <w:pPr>
+              <w:pStyle w:val="ListParagraph"/>
+              <w:keepNext/>
+              <w:keepLines/>
+              <w:numPr>
+                <w:ilvl w:val="0"/>
+                <w:numId w:val="10"/>
+              </w:numPr>
+              <w:spacing w:after="120" w:line="240" w:lineRule="auto"/>
+              <w:jc w:val="both"/>
+              <w:outlineLvl w:val="1"/>
+              <w:rPr>
+                <w:rFonts w:ascii="Times New Roman" w:eastAsia="Times New Roman" w:hAnsi="Times New Roman" w:cs="Times New Roman"/>
+                <w:bCs/>
+                <w:color w:val="404040"/>
+                <w:kern w:val="0"/>
+                <w:sz w:val="22"/>
+                <w:szCs w:val="22"/>
+                <w14:ligatures w14:val="none"/>
+              </w:rPr>
+            </w:pPr>
+            <w:r>
+              <w:rPr>
+                <w:rFonts w:ascii="Times New Roman" w:eastAsia="Times New Roman" w:hAnsi="Times New Roman" w:cs="Times New Roman"/>
+                <w:bCs/>
+                <w:color w:val="404040"/>
+                <w:kern w:val="0"/>
+                <w:sz w:val="22"/>
+                <w:szCs w:val="22"/>
+                <w14:ligatures w14:val="none"/>
+              </w:rPr>
+              <w:t xml:space="preserve">Designed and implemented a machine learning-based wind profile reconstruction framework from global reanalysis datasets using </w:t>
+            </w:r>
+            <w:proofErr w:type="spellStart"/>
+            <w:r>
+              <w:rPr>
+                <w:rFonts w:ascii="Times New Roman" w:eastAsia="Times New Roman" w:hAnsi="Times New Roman" w:cs="Times New Roman"/>
+                <w:bCs/>
+                <w:color w:val="404040"/>
+                <w:kern w:val="0"/>
+                <w:sz w:val="22"/>
+                <w:szCs w:val="22"/>
+                <w14:ligatures w14:val="none"/>
+              </w:rPr>
+              <w:t>TabNet</w:t>
+            </w:r>
+            <w:proofErr w:type="spellEnd"/>
+            <w:r>
+              <w:rPr>
+                <w:rFonts w:ascii="Times New Roman" w:eastAsia="Times New Roman" w:hAnsi="Times New Roman" w:cs="Times New Roman"/>
+                <w:bCs/>
+                <w:color w:val="404040"/>
+                <w:kern w:val="0"/>
+                <w:sz w:val="22"/>
+                <w:szCs w:val="22"/>
+                <w14:ligatures w14:val="none"/>
+              </w:rPr>
+              <w:t>, improving vertical wind characterization for turbine-relevant heights.</w:t>
+            </w:r>
+          </w:p>
+          <w:p>
+            <w:pPr>
+              <w:pStyle w:val="ListParagraph"/>
+              <w:keepNext/>
+              <w:keepLines/>
+              <w:numPr>
+                <w:ilvl w:val="0"/>
+                <w:numId w:val="10"/>
+              </w:numPr>
+              <w:spacing w:after="120" w:line="240" w:lineRule="auto"/>
+              <w:jc w:val="both"/>
+              <w:outlineLvl w:val="1"/>
+              <w:rPr>
+                <w:rFonts w:ascii="Times New Roman" w:eastAsia="Times New Roman" w:hAnsi="Times New Roman" w:cs="Times New Roman"/>
+                <w:bCs/>
+                <w:color w:val="404040"/>
+                <w:kern w:val="0"/>
+                <w:sz w:val="22"/>
+                <w:szCs w:val="22"/>
+                <w14:ligatures w14:val="none"/>
+              </w:rPr>
+            </w:pPr>
+            <w:r>
+              <w:rPr>
+                <w:rFonts w:ascii="Times New Roman" w:eastAsia="Times New Roman" w:hAnsi="Times New Roman" w:cs="Times New Roman"/>
+                <w:bCs/>
+                <w:color w:val="404040"/>
+                <w:kern w:val="0"/>
+                <w:sz w:val="22"/>
+                <w:szCs w:val="22"/>
+                <w14:ligatures w14:val="none"/>
+              </w:rPr>
+              <w:t>Analyzed frontal low-level jets and extreme wind ramp events, quantifying their impact on wind power variability and operational ramp risk.</w:t>
+            </w:r>
+          </w:p>
+          <w:p>
+            <w:pPr>
+              <w:pStyle w:val="ListParagraph"/>
+              <w:keepNext/>
+              <w:keepLines/>
+              <w:numPr>
+                <w:ilvl w:val="0"/>
+                <w:numId w:val="10"/>
+              </w:numPr>
+              <w:spacing w:after="120" w:line="240" w:lineRule="auto"/>
+              <w:jc w:val="both"/>
+              <w:outlineLvl w:val="1"/>
+              <w:rPr>
+                <w:rFonts w:ascii="Times New Roman" w:eastAsia="Times New Roman" w:hAnsi="Times New Roman" w:cs="Times New Roman"/>
+                <w:bCs/>
+                <w:color w:val="404040"/>
+                <w:kern w:val="0"/>
+                <w:sz w:val="22"/>
+                <w:szCs w:val="22"/>
+                <w14:ligatures w14:val="none"/>
+              </w:rPr>
+            </w:pPr>
+            <w:r>
+              <w:rPr>
+                <w:rFonts w:ascii="Times New Roman" w:eastAsia="Times New Roman" w:hAnsi="Times New Roman" w:cs="Times New Roman"/>
+                <w:bCs/>
+                <w:color w:val="404040"/>
+                <w:kern w:val="0"/>
+                <w:sz w:val="22"/>
+                <w:szCs w:val="22"/>
+                <w14:ligatures w14:val="none"/>
+              </w:rPr>
+              <w:t>Conducted validation and benchmarking of model outputs against reanalysis and observational datasets to assess forecast reliability and extreme-event representation.</w:t>
+            </w:r>
+          </w:p>
+        </w:tc>
+      </w:tr>
+      <w:tr>
+        <w:tc>
+          <w:tcPr>
+            <w:tcW w:w="6389" w:type="dxa"/>
+            <w:gridSpan w:val="3"/>
+          </w:tcPr>
+          <w:p>
+            <w:pPr>
+              <w:keepNext/>
+              <w:keepLines/>
+              <w:spacing w:after="120" w:line="240" w:lineRule="auto"/>
+              <w:outlineLvl w:val="1"/>
+              <w:rPr>
+                <w:rFonts w:ascii="Times New Roman" w:eastAsia="Times New Roman" w:hAnsi="Times New Roman" w:cs="Times New Roman"/>
+                <w:b/>
+                <w:color w:val="404040"/>
+                <w:kern w:val="0"/>
+                <w:sz w:val="22"/>
+                <w:szCs w:val="22"/>
+                <w14:ligatures w14:val="none"/>
+              </w:rPr>
+            </w:pPr>
+            <w:r>
+              <w:rPr>
+                <w:rFonts w:ascii="Times New Roman" w:eastAsia="Times New Roman" w:hAnsi="Times New Roman" w:cs="Times New Roman"/>
+                <w:b/>
+                <w:color w:val="404040"/>
+                <w:kern w:val="0"/>
+                <w:sz w:val="22"/>
+                <w:szCs w:val="22"/>
+                <w14:ligatures w14:val="none"/>
+              </w:rPr>
+              <w:t>Indian Institute of Technology Madras</w:t>
+            </w:r>
+          </w:p>
+          <w:p>
+            <w:pPr>
+              <w:keepNext/>
+              <w:keepLines/>
+              <w:spacing w:after="120" w:line="240" w:lineRule="auto"/>
+              <w:outlineLvl w:val="1"/>
+              <w:rPr>
+                <w:rFonts w:ascii="Times New Roman" w:eastAsia="Times New Roman" w:hAnsi="Times New Roman" w:cs="Times New Roman"/>
+                <w:bCs/>
+                <w:color w:val="404040"/>
+                <w:kern w:val="0"/>
+                <w:sz w:val="22"/>
+                <w:szCs w:val="22"/>
+                <w14:ligatures w14:val="none"/>
+              </w:rPr>
+            </w:pPr>
+            <w:r>
+              <w:rPr>
+                <w:rFonts w:ascii="Times New Roman" w:eastAsia="Times New Roman" w:hAnsi="Times New Roman" w:cs="Times New Roman"/>
+                <w:bCs/>
+                <w:color w:val="404040"/>
+                <w:kern w:val="0"/>
+                <w:sz w:val="22"/>
+                <w:szCs w:val="22"/>
+                <w14:ligatures w14:val="none"/>
+              </w:rPr>
+              <w:t>Institute Postdoctoral Equivalent Fellowship</w:t>
+            </w:r>
+          </w:p>
+        </w:tc>
+        <w:tc>
+          <w:tcPr>
+            <w:tcW w:w="2961" w:type="dxa"/>
+            <w:gridSpan w:val="2"/>
+          </w:tcPr>
+          <w:p>
+            <w:pPr>
+              <w:keepNext/>
+              <w:keepLines/>
+              <w:spacing w:after="120" w:line="240" w:lineRule="auto"/>
+              <w:jc w:val="right"/>
+              <w:outlineLvl w:val="1"/>
+              <w:rPr>
+                <w:rFonts w:ascii="Times New Roman" w:eastAsia="Times New Roman" w:hAnsi="Times New Roman" w:cs="Times New Roman"/>
+                <w:bCs/>
+                <w:color w:val="404040"/>
+                <w:kern w:val="0"/>
+                <w:sz w:val="22"/>
+                <w:szCs w:val="22"/>
+                <w14:ligatures w14:val="none"/>
+              </w:rPr>
+            </w:pPr>
+            <w:r>
+              <w:rPr>
+                <w:rFonts w:ascii="Times New Roman" w:eastAsia="Times New Roman" w:hAnsi="Times New Roman" w:cs="Times New Roman"/>
+                <w:bCs/>
+                <w:color w:val="404040"/>
+                <w:kern w:val="0"/>
+                <w:sz w:val="22"/>
+                <w:szCs w:val="22"/>
+                <w14:ligatures w14:val="none"/>
+              </w:rPr>
+              <w:t>Chennai, Tamil Nadu, India</w:t>
+            </w:r>
+          </w:p>
+          <w:p>
+            <w:pPr>
+              <w:keepNext/>
+              <w:keepLines/>
+              <w:spacing w:after="120" w:line="240" w:lineRule="auto"/>
+              <w:jc w:val="right"/>
+              <w:outlineLvl w:val="1"/>
+              <w:rPr>
+                <w:rFonts w:ascii="Times New Roman" w:eastAsia="Times New Roman" w:hAnsi="Times New Roman" w:cs="Times New Roman"/>
+                <w:bCs/>
+                <w:color w:val="404040"/>
+                <w:kern w:val="0"/>
+                <w:sz w:val="22"/>
+                <w:szCs w:val="22"/>
+                <w14:ligatures w14:val="none"/>
+              </w:rPr>
+            </w:pPr>
+            <w:r>
+              <w:rPr>
+                <w:rFonts w:ascii="Times New Roman" w:eastAsia="Times New Roman" w:hAnsi="Times New Roman" w:cs="Times New Roman"/>
+                <w:bCs/>
+                <w:color w:val="404040"/>
+                <w:kern w:val="0"/>
+                <w:sz w:val="22"/>
+                <w:szCs w:val="22"/>
+                <w14:ligatures w14:val="none"/>
+              </w:rPr>
               <w:t xml:space="preserve">January </w:t>
             </w:r>
             <w:r>
@@ -1812,6 +2237,68 @@
                 <w14:ligatures w14:val="none"/>
               </w:rPr>
               <w:t>2022</w:t>
+            </w:r>
+          </w:p>
+        </w:tc>
+      </w:tr>
+      <w:tr>
+        <w:tc>
+          <w:tcPr>
+            <w:tcW w:w="9350" w:type="dxa"/>
+            <w:gridSpan w:val="5"/>
+          </w:tcPr>
+          <w:p>
+            <w:pPr>
+              <w:pStyle w:val="ListParagraph"/>
+              <w:numPr>
+                <w:ilvl w:val="0"/>
+                <w:numId w:val="12"/>
+              </w:numPr>
+              <w:rPr>
+                <w:rFonts w:ascii="Times New Roman" w:hAnsi="Times New Roman" w:cs="Times New Roman"/>
+                <w:color w:val="0E0E0E"/>
+                <w:sz w:val="22"/>
+                <w:szCs w:val="22"/>
+              </w:rPr>
+            </w:pPr>
+            <w:r>
+              <w:rPr>
+                <w:rFonts w:ascii="Times New Roman" w:hAnsi="Times New Roman" w:cs="Times New Roman"/>
+                <w:color w:val="0E0E0E"/>
+                <w:sz w:val="22"/>
+                <w:szCs w:val="22"/>
+              </w:rPr>
+              <w:t xml:space="preserve">Co-led development and calibration of a coupled COAWST–WRF air–sea interaction forecasting system, delivered to the Indian Space Research </w:t>
+            </w:r>
+            <w:r>
+              <w:rPr>
+                <w:rFonts w:ascii="Times New Roman" w:hAnsi="Times New Roman" w:cs="Times New Roman"/>
+                <w:color w:val="0E0E0E"/>
+                <w:sz w:val="22"/>
+                <w:szCs w:val="22"/>
+              </w:rPr>
+              <w:t>Organization</w:t>
+            </w:r>
+            <w:r>
+              <w:rPr>
+                <w:rFonts w:ascii="Times New Roman" w:hAnsi="Times New Roman" w:cs="Times New Roman"/>
+                <w:color w:val="0E0E0E"/>
+                <w:sz w:val="22"/>
+                <w:szCs w:val="22"/>
+              </w:rPr>
+              <w:t xml:space="preserve"> (ISRO) for operational evaluation</w:t>
+            </w:r>
+            <w:r>
+              <w:rPr>
+                <w:rFonts w:ascii="Times New Roman" w:eastAsia="Times New Roman" w:hAnsi="Times New Roman" w:cs="Times New Roman"/>
+                <w:bCs/>
+                <w:color w:val="404040"/>
+                <w:kern w:val="0"/>
+                <w:sz w:val="22"/>
+                <w:szCs w:val="22"/>
+                <w14:ligatures w14:val="none"/>
+              </w:rPr>
+              <w:t xml:space="preserve">. </w:t>
             </w:r>
           </w:p>
         </w:tc>
@@ -1962,7 +2449,6 @@
                 <w:kern w:val="0"/>
                 <w14:ligatures w14:val="none"/>
               </w:rPr>
-              <w:lastRenderedPageBreak/>
               <w:t>selected accomplishments</w:t>
             </w:r>
           </w:p>
@@ -2052,17 +2538,6 @@
                 <w14:ligatures w14:val="none"/>
               </w:rPr>
               <w:t>https://weather4cast.net/neurips2023</w:t>
-            </w:r>
-            <w:r>
-              <w:rPr>
-                <w:rFonts w:ascii="Times New Roman" w:eastAsia="Gill Sans MT" w:hAnsi="Times New Roman" w:cs="Times New Roman"/>
-                <w:color w:val="000000"/>
-                <w:kern w:val="0"/>
-                <w:sz w:val="22"/>
-                <w:szCs w:val="22"/>
-                <w14:ligatures w14:val="none"/>
-              </w:rPr>
-              <w:t>/</w:t>
             </w:r>
           </w:p>
         </w:tc>
@@ -2580,6 +3055,7 @@
                 <w:szCs w:val="22"/>
                 <w14:ligatures w14:val="none"/>
               </w:rPr>
+              <w:lastRenderedPageBreak/>
               <w:t>Coursera: Introduction to Machine learning</w:t>
             </w:r>
           </w:p>
@@ -2687,7 +3163,7 @@
                 <w:szCs w:val="22"/>
                 <w14:ligatures w14:val="none"/>
               </w:rPr>
-              <w:t>Frameworks &amp; Libraries</w:t>
+              <w:t>Programming &amp; Data Engineering</w:t>
             </w:r>
           </w:p>
         </w:tc>
@@ -2729,8 +3205,22 @@
                 <w:szCs w:val="22"/>
                 <w14:ligatures w14:val="none"/>
               </w:rPr>
-              <w:t>TensorFlow</w:t>
-            </w:r>
+              <w:t xml:space="preserve">Python (NumPy, Pandas, SciPy), </w:t>
+            </w:r>
+            <w:proofErr w:type="spellStart"/>
+            <w:r>
+              <w:rPr>
+                <w:rFonts w:ascii="Times New Roman" w:eastAsia="Times New Roman" w:hAnsi="Times New Roman" w:cs="Times New Roman"/>
+                <w:bCs/>
+                <w:color w:val="404040"/>
+                <w:kern w:val="0"/>
+                <w:sz w:val="22"/>
+                <w:szCs w:val="22"/>
+                <w14:ligatures w14:val="none"/>
+              </w:rPr>
+              <w:t>Xarray</w:t>
+            </w:r>
+            <w:proofErr w:type="spellEnd"/>
             <w:r>
               <w:rPr>
                 <w:rFonts w:ascii="Times New Roman" w:eastAsia="Times New Roman" w:hAnsi="Times New Roman" w:cs="Times New Roman"/>
@@ -2754,7 +3244,7 @@
                 <w:szCs w:val="22"/>
                 <w14:ligatures w14:val="none"/>
               </w:rPr>
-              <w:t>PyTorch</w:t>
+              <w:t>Dask</w:t>
             </w:r>
             <w:proofErr w:type="spellEnd"/>
             <w:r>
@@ -2767,70 +3257,8 @@
                 <w:szCs w:val="22"/>
                 <w14:ligatures w14:val="none"/>
               </w:rPr>
-              <w:t xml:space="preserve">, </w:t>
-            </w:r>
-            <w:r>
-              <w:rPr>
-                <w:rFonts w:ascii="Times New Roman" w:eastAsia="Times New Roman" w:hAnsi="Times New Roman" w:cs="Times New Roman"/>
-                <w:bCs/>
-                <w:color w:val="404040"/>
-                <w:kern w:val="0"/>
-                <w:sz w:val="22"/>
-                <w:szCs w:val="22"/>
-                <w14:ligatures w14:val="none"/>
-              </w:rPr>
-              <w:t>Torch Lightning</w:t>
-            </w:r>
-            <w:r>
-              <w:rPr>
-                <w:rFonts w:ascii="Times New Roman" w:eastAsia="Times New Roman" w:hAnsi="Times New Roman" w:cs="Times New Roman"/>
-                <w:bCs/>
-                <w:color w:val="404040"/>
-                <w:kern w:val="0"/>
-                <w:sz w:val="22"/>
-                <w:szCs w:val="22"/>
-                <w14:ligatures w14:val="none"/>
-              </w:rPr>
-              <w:t xml:space="preserve">, </w:t>
-            </w:r>
-            <w:r>
-              <w:rPr>
-                <w:rFonts w:ascii="Times New Roman" w:eastAsia="Times New Roman" w:hAnsi="Times New Roman" w:cs="Times New Roman"/>
-                <w:bCs/>
-                <w:color w:val="404040"/>
-                <w:kern w:val="0"/>
-                <w:sz w:val="22"/>
-                <w:szCs w:val="22"/>
-                <w14:ligatures w14:val="none"/>
-              </w:rPr>
-              <w:t>Scikit-Learn</w:t>
-            </w:r>
-            <w:r>
-              <w:rPr>
-                <w:rFonts w:ascii="Times New Roman" w:eastAsia="Times New Roman" w:hAnsi="Times New Roman" w:cs="Times New Roman"/>
-                <w:bCs/>
-                <w:color w:val="404040"/>
-                <w:kern w:val="0"/>
-                <w:sz w:val="22"/>
-                <w:szCs w:val="22"/>
-                <w14:ligatures w14:val="none"/>
-              </w:rPr>
-              <w:t xml:space="preserve">, </w:t>
-            </w:r>
-            <w:proofErr w:type="spellStart"/>
-            <w:r>
-              <w:rPr>
-                <w:rFonts w:ascii="Times New Roman" w:eastAsia="Times New Roman" w:hAnsi="Times New Roman" w:cs="Times New Roman"/>
-                <w:bCs/>
-                <w:color w:val="404040"/>
-                <w:kern w:val="0"/>
-                <w:sz w:val="22"/>
-                <w:szCs w:val="22"/>
-                <w14:ligatures w14:val="none"/>
-              </w:rPr>
-              <w:t>AutoML</w:t>
-            </w:r>
-            <w:proofErr w:type="spellEnd"/>
+              <w:t>, Zarr</w:t>
+            </w:r>
           </w:p>
         </w:tc>
       </w:tr>
@@ -2866,19 +3294,7 @@
                 <w:szCs w:val="22"/>
                 <w14:ligatures w14:val="none"/>
               </w:rPr>
-              <w:t>ML &amp; DL</w:t>
-            </w:r>
-            <w:r>
-              <w:rPr>
-                <w:rFonts w:ascii="Times New Roman" w:eastAsia="Times New Roman" w:hAnsi="Times New Roman" w:cs="Times New Roman"/>
-                <w:b/>
-                <w:color w:val="404040"/>
-                <w:kern w:val="0"/>
-                <w:sz w:val="22"/>
-                <w:szCs w:val="22"/>
-                <w14:ligatures w14:val="none"/>
-              </w:rPr>
-              <w:t xml:space="preserve"> models</w:t>
+              <w:t>Machine Learning &amp; Forecast Modeling</w:t>
             </w:r>
           </w:p>
         </w:tc>
@@ -2910,18 +3326,6 @@
                 <w14:ligatures w14:val="none"/>
               </w:rPr>
             </w:pPr>
-            <w:r>
-              <w:rPr>
-                <w:rFonts w:ascii="Times New Roman" w:eastAsia="Times New Roman" w:hAnsi="Times New Roman" w:cs="Times New Roman"/>
-                <w:bCs/>
-                <w:color w:val="404040"/>
-                <w:kern w:val="0"/>
-                <w:sz w:val="22"/>
-                <w:szCs w:val="22"/>
-                <w14:ligatures w14:val="none"/>
-              </w:rPr>
-              <w:t xml:space="preserve">Classical: Gaussian Process Regression, SVM, Random Forest, </w:t>
-            </w:r>
             <w:proofErr w:type="spellStart"/>
             <w:r>
               <w:rPr>
@@ -2933,7 +3337,7 @@
                 <w:szCs w:val="22"/>
                 <w14:ligatures w14:val="none"/>
               </w:rPr>
-              <w:t>XGBoost</w:t>
+              <w:t>PyTorch</w:t>
             </w:r>
             <w:proofErr w:type="spellEnd"/>
             <w:r>
@@ -2946,22 +3350,8 @@
                 <w:szCs w:val="22"/>
                 <w14:ligatures w14:val="none"/>
               </w:rPr>
-              <w:t xml:space="preserve">, </w:t>
-            </w:r>
-            <w:proofErr w:type="spellStart"/>
-            <w:r>
-              <w:rPr>
-                <w:rFonts w:ascii="Times New Roman" w:eastAsia="Times New Roman" w:hAnsi="Times New Roman" w:cs="Times New Roman"/>
-                <w:bCs/>
-                <w:color w:val="404040"/>
-                <w:kern w:val="0"/>
-                <w:sz w:val="22"/>
-                <w:szCs w:val="22"/>
-                <w14:ligatures w14:val="none"/>
-              </w:rPr>
-              <w:t>LightGBM</w:t>
-            </w:r>
-            <w:proofErr w:type="spellEnd"/>
+              <w:t>, TensorFlow, Torch Lightning</w:t>
+            </w:r>
           </w:p>
           <w:p>
             <w:pPr>
@@ -2994,312 +3384,9 @@
                 <w:szCs w:val="22"/>
                 <w14:ligatures w14:val="none"/>
               </w:rPr>
-              <w:t>Deep Learning:</w:t>
-            </w:r>
-          </w:p>
-          <w:p>
-            <w:pPr>
-              <w:pStyle w:val="ListParagraph"/>
-              <w:keepNext/>
-              <w:keepLines/>
-              <w:numPr>
-                <w:ilvl w:val="1"/>
-                <w:numId w:val="2"/>
-              </w:numPr>
-              <w:spacing w:after="120" w:line="240" w:lineRule="auto"/>
-              <w:outlineLvl w:val="1"/>
-              <w:rPr>
-                <w:rFonts w:ascii="Times New Roman" w:eastAsia="Times New Roman" w:hAnsi="Times New Roman" w:cs="Times New Roman"/>
-                <w:bCs/>
-                <w:color w:val="404040"/>
-                <w:kern w:val="0"/>
-                <w:sz w:val="22"/>
-                <w:szCs w:val="22"/>
-                <w14:ligatures w14:val="none"/>
-              </w:rPr>
-            </w:pPr>
-            <w:r>
-              <w:rPr>
-                <w:rFonts w:ascii="Times New Roman" w:eastAsia="Times New Roman" w:hAnsi="Times New Roman" w:cs="Times New Roman"/>
-                <w:bCs/>
-                <w:color w:val="404040"/>
-                <w:kern w:val="0"/>
-                <w:sz w:val="22"/>
-                <w:szCs w:val="22"/>
-                <w14:ligatures w14:val="none"/>
-              </w:rPr>
-              <w:t>Artificial Neural Networks</w:t>
-            </w:r>
-            <w:r>
-              <w:rPr>
-                <w:rFonts w:ascii="Times New Roman" w:eastAsia="Times New Roman" w:hAnsi="Times New Roman" w:cs="Times New Roman"/>
-                <w:bCs/>
-                <w:color w:val="404040"/>
-                <w:kern w:val="0"/>
-                <w:sz w:val="22"/>
-                <w:szCs w:val="22"/>
-                <w14:ligatures w14:val="none"/>
-              </w:rPr>
-              <w:t xml:space="preserve"> (ANN)</w:t>
-            </w:r>
-          </w:p>
-          <w:p>
-            <w:pPr>
-              <w:pStyle w:val="ListParagraph"/>
-              <w:keepNext/>
-              <w:keepLines/>
-              <w:numPr>
-                <w:ilvl w:val="1"/>
-                <w:numId w:val="2"/>
-              </w:numPr>
-              <w:spacing w:after="120" w:line="240" w:lineRule="auto"/>
-              <w:outlineLvl w:val="1"/>
-              <w:rPr>
-                <w:rFonts w:ascii="Times New Roman" w:eastAsia="Times New Roman" w:hAnsi="Times New Roman" w:cs="Times New Roman"/>
-                <w:bCs/>
-                <w:color w:val="404040"/>
-                <w:kern w:val="0"/>
-                <w:sz w:val="22"/>
-                <w:szCs w:val="22"/>
-                <w14:ligatures w14:val="none"/>
-              </w:rPr>
-            </w:pPr>
-            <w:proofErr w:type="spellStart"/>
-            <w:r>
-              <w:rPr>
-                <w:rFonts w:ascii="Times New Roman" w:eastAsia="Times New Roman" w:hAnsi="Times New Roman" w:cs="Times New Roman"/>
-                <w:bCs/>
-                <w:color w:val="404040"/>
-                <w:kern w:val="0"/>
-                <w:sz w:val="22"/>
-                <w:szCs w:val="22"/>
-                <w14:ligatures w14:val="none"/>
-              </w:rPr>
-              <w:t>TabNet</w:t>
-            </w:r>
-            <w:proofErr w:type="spellEnd"/>
-            <w:r>
-              <w:rPr>
-                <w:rFonts w:ascii="Times New Roman" w:eastAsia="Times New Roman" w:hAnsi="Times New Roman" w:cs="Times New Roman"/>
-                <w:bCs/>
-                <w:color w:val="404040"/>
-                <w:kern w:val="0"/>
-                <w:sz w:val="22"/>
-                <w:szCs w:val="22"/>
-                <w14:ligatures w14:val="none"/>
-              </w:rPr>
-              <w:t xml:space="preserve"> </w:t>
-            </w:r>
-          </w:p>
-          <w:p>
-            <w:pPr>
-              <w:pStyle w:val="ListParagraph"/>
-              <w:keepNext/>
-              <w:keepLines/>
-              <w:numPr>
-                <w:ilvl w:val="1"/>
-                <w:numId w:val="2"/>
-              </w:numPr>
-              <w:spacing w:after="120" w:line="240" w:lineRule="auto"/>
-              <w:outlineLvl w:val="1"/>
-              <w:rPr>
-                <w:rFonts w:ascii="Times New Roman" w:eastAsia="Times New Roman" w:hAnsi="Times New Roman" w:cs="Times New Roman"/>
-                <w:bCs/>
-                <w:color w:val="404040"/>
-                <w:kern w:val="0"/>
-                <w:sz w:val="22"/>
-                <w:szCs w:val="22"/>
-                <w14:ligatures w14:val="none"/>
-              </w:rPr>
-            </w:pPr>
-            <w:r>
-              <w:rPr>
-                <w:rFonts w:ascii="Times New Roman" w:eastAsia="Times New Roman" w:hAnsi="Times New Roman" w:cs="Times New Roman"/>
-                <w:bCs/>
-                <w:color w:val="404040"/>
-                <w:kern w:val="0"/>
-                <w:sz w:val="22"/>
-                <w:szCs w:val="22"/>
-                <w14:ligatures w14:val="none"/>
-              </w:rPr>
-              <w:t>Convolution Neural Networks</w:t>
-            </w:r>
-            <w:r>
-              <w:rPr>
-                <w:rFonts w:ascii="Times New Roman" w:eastAsia="Times New Roman" w:hAnsi="Times New Roman" w:cs="Times New Roman"/>
-                <w:bCs/>
-                <w:color w:val="404040"/>
-                <w:kern w:val="0"/>
-                <w:sz w:val="22"/>
-                <w:szCs w:val="22"/>
-                <w14:ligatures w14:val="none"/>
-              </w:rPr>
-              <w:t xml:space="preserve"> (CNN)</w:t>
-            </w:r>
-          </w:p>
-          <w:p>
-            <w:pPr>
-              <w:pStyle w:val="ListParagraph"/>
-              <w:keepNext/>
-              <w:keepLines/>
-              <w:numPr>
-                <w:ilvl w:val="1"/>
-                <w:numId w:val="2"/>
-              </w:numPr>
-              <w:spacing w:after="120" w:line="240" w:lineRule="auto"/>
-              <w:outlineLvl w:val="1"/>
-              <w:rPr>
-                <w:rFonts w:ascii="Times New Roman" w:eastAsia="Times New Roman" w:hAnsi="Times New Roman" w:cs="Times New Roman"/>
-                <w:bCs/>
-                <w:color w:val="404040"/>
-                <w:kern w:val="0"/>
-                <w:sz w:val="22"/>
-                <w:szCs w:val="22"/>
-                <w14:ligatures w14:val="none"/>
-              </w:rPr>
-            </w:pPr>
-            <w:r>
-              <w:rPr>
-                <w:rFonts w:ascii="Times New Roman" w:eastAsia="Times New Roman" w:hAnsi="Times New Roman" w:cs="Times New Roman"/>
-                <w:bCs/>
-                <w:color w:val="404040"/>
-                <w:kern w:val="0"/>
-                <w:sz w:val="22"/>
-                <w:szCs w:val="22"/>
-                <w14:ligatures w14:val="none"/>
-              </w:rPr>
-              <w:t>Sifted Window Multiheaded self-attention transformer</w:t>
-            </w:r>
-            <w:r>
-              <w:rPr>
-                <w:rFonts w:ascii="Times New Roman" w:eastAsia="Times New Roman" w:hAnsi="Times New Roman" w:cs="Times New Roman"/>
-                <w:bCs/>
-                <w:color w:val="404040"/>
-                <w:kern w:val="0"/>
-                <w:sz w:val="22"/>
-                <w:szCs w:val="22"/>
-                <w14:ligatures w14:val="none"/>
-              </w:rPr>
-              <w:t xml:space="preserve"> (</w:t>
-            </w:r>
-            <w:proofErr w:type="spellStart"/>
-            <w:r>
-              <w:rPr>
-                <w:rFonts w:ascii="Times New Roman" w:eastAsia="Times New Roman" w:hAnsi="Times New Roman" w:cs="Times New Roman"/>
-                <w:bCs/>
-                <w:color w:val="404040"/>
-                <w:kern w:val="0"/>
-                <w:sz w:val="22"/>
-                <w:szCs w:val="22"/>
-                <w14:ligatures w14:val="none"/>
-              </w:rPr>
-              <w:t>SwinTransformer</w:t>
-            </w:r>
-            <w:proofErr w:type="spellEnd"/>
-            <w:r>
-              <w:rPr>
-                <w:rFonts w:ascii="Times New Roman" w:eastAsia="Times New Roman" w:hAnsi="Times New Roman" w:cs="Times New Roman"/>
-                <w:bCs/>
-                <w:color w:val="404040"/>
-                <w:kern w:val="0"/>
-                <w:sz w:val="22"/>
-                <w:szCs w:val="22"/>
-                <w14:ligatures w14:val="none"/>
-              </w:rPr>
-              <w:t>)</w:t>
-            </w:r>
-          </w:p>
-          <w:p>
-            <w:pPr>
-              <w:pStyle w:val="ListParagraph"/>
-              <w:keepNext/>
-              <w:keepLines/>
-              <w:numPr>
-                <w:ilvl w:val="1"/>
-                <w:numId w:val="2"/>
-              </w:numPr>
-              <w:spacing w:after="120" w:line="240" w:lineRule="auto"/>
-              <w:outlineLvl w:val="1"/>
-              <w:rPr>
-                <w:rFonts w:ascii="Times New Roman" w:eastAsia="Times New Roman" w:hAnsi="Times New Roman" w:cs="Times New Roman"/>
-                <w:bCs/>
-                <w:color w:val="404040"/>
-                <w:kern w:val="0"/>
-                <w:sz w:val="22"/>
-                <w:szCs w:val="22"/>
-                <w14:ligatures w14:val="none"/>
-              </w:rPr>
-            </w:pPr>
-            <w:r>
-              <w:rPr>
-                <w:rFonts w:ascii="Times New Roman" w:eastAsia="Times New Roman" w:hAnsi="Times New Roman" w:cs="Times New Roman"/>
-                <w:bCs/>
-                <w:color w:val="404040"/>
-                <w:kern w:val="0"/>
-                <w:sz w:val="22"/>
-                <w:szCs w:val="22"/>
-                <w14:ligatures w14:val="none"/>
-              </w:rPr>
-              <w:t>Generative adversarial network</w:t>
-            </w:r>
-            <w:r>
-              <w:rPr>
-                <w:rFonts w:ascii="Times New Roman" w:eastAsia="Times New Roman" w:hAnsi="Times New Roman" w:cs="Times New Roman"/>
-                <w:bCs/>
-                <w:color w:val="404040"/>
-                <w:kern w:val="0"/>
-                <w:sz w:val="22"/>
-                <w:szCs w:val="22"/>
-                <w14:ligatures w14:val="none"/>
-              </w:rPr>
-              <w:t xml:space="preserve"> (GAN)</w:t>
-            </w:r>
-          </w:p>
-        </w:tc>
-      </w:tr>
-      <w:tr>
-        <w:tc>
-          <w:tcPr>
-            <w:tcW w:w="9350" w:type="dxa"/>
-            <w:gridSpan w:val="5"/>
-          </w:tcPr>
-          <w:p>
-            <w:pPr>
-              <w:keepNext/>
-              <w:keepLines/>
-              <w:spacing w:after="120" w:line="240" w:lineRule="auto"/>
-              <w:outlineLvl w:val="1"/>
-              <w:rPr>
-                <w:rFonts w:ascii="Times New Roman" w:eastAsia="Times New Roman" w:hAnsi="Times New Roman" w:cs="Times New Roman"/>
-                <w:bCs/>
-                <w:color w:val="404040"/>
-                <w:kern w:val="0"/>
-                <w:sz w:val="22"/>
-                <w:szCs w:val="22"/>
-                <w14:ligatures w14:val="none"/>
-              </w:rPr>
-            </w:pPr>
-            <w:r>
-              <w:rPr>
-                <w:rFonts w:ascii="Times New Roman" w:eastAsia="Times New Roman" w:hAnsi="Times New Roman" w:cs="Times New Roman"/>
-                <w:b/>
-                <w:color w:val="404040"/>
-                <w:kern w:val="0"/>
-                <w:sz w:val="22"/>
-                <w:szCs w:val="22"/>
-                <w14:ligatures w14:val="none"/>
-              </w:rPr>
-              <w:t>Data processing tools</w:t>
-            </w:r>
-          </w:p>
-        </w:tc>
-      </w:tr>
-      <w:tr>
-        <w:tc>
-          <w:tcPr>
-            <w:tcW w:w="9350" w:type="dxa"/>
-            <w:gridSpan w:val="5"/>
-          </w:tcPr>
+              <w:t>Gaussian Process Regression, Bayesian Optimization</w:t>
+            </w:r>
+          </w:p>
           <w:p>
             <w:pPr>
               <w:pStyle w:val="ListParagraph"/>
@@ -3321,96 +3408,244 @@
                 <w14:ligatures w14:val="none"/>
               </w:rPr>
             </w:pPr>
-            <w:proofErr w:type="spellStart"/>
-            <w:r>
-              <w:rPr>
-                <w:rFonts w:ascii="Times New Roman" w:eastAsia="Times New Roman" w:hAnsi="Times New Roman" w:cs="Times New Roman"/>
-                <w:bCs/>
-                <w:color w:val="404040"/>
-                <w:kern w:val="0"/>
-                <w:sz w:val="22"/>
-                <w:szCs w:val="22"/>
-                <w14:ligatures w14:val="none"/>
-              </w:rPr>
-              <w:t>Xarray</w:t>
-            </w:r>
-            <w:proofErr w:type="spellEnd"/>
-            <w:r>
-              <w:rPr>
-                <w:rFonts w:ascii="Times New Roman" w:eastAsia="Times New Roman" w:hAnsi="Times New Roman" w:cs="Times New Roman"/>
-                <w:bCs/>
-                <w:color w:val="404040"/>
-                <w:kern w:val="0"/>
-                <w:sz w:val="22"/>
-                <w:szCs w:val="22"/>
-                <w14:ligatures w14:val="none"/>
-              </w:rPr>
-              <w:t xml:space="preserve">, </w:t>
-            </w:r>
-            <w:r>
-              <w:rPr>
-                <w:rFonts w:ascii="Times New Roman" w:eastAsia="Times New Roman" w:hAnsi="Times New Roman" w:cs="Times New Roman"/>
-                <w:bCs/>
-                <w:color w:val="404040"/>
-                <w:kern w:val="0"/>
-                <w:sz w:val="22"/>
-                <w:szCs w:val="22"/>
-                <w14:ligatures w14:val="none"/>
-              </w:rPr>
-              <w:t>Zarr</w:t>
-            </w:r>
-            <w:r>
-              <w:rPr>
-                <w:rFonts w:ascii="Times New Roman" w:eastAsia="Times New Roman" w:hAnsi="Times New Roman" w:cs="Times New Roman"/>
-                <w:bCs/>
-                <w:color w:val="404040"/>
-                <w:kern w:val="0"/>
-                <w:sz w:val="22"/>
-                <w:szCs w:val="22"/>
-                <w14:ligatures w14:val="none"/>
-              </w:rPr>
-              <w:t xml:space="preserve">, </w:t>
-            </w:r>
-            <w:proofErr w:type="spellStart"/>
-            <w:r>
-              <w:rPr>
-                <w:rFonts w:ascii="Times New Roman" w:eastAsia="Times New Roman" w:hAnsi="Times New Roman" w:cs="Times New Roman"/>
-                <w:bCs/>
-                <w:color w:val="404040"/>
-                <w:kern w:val="0"/>
-                <w:sz w:val="22"/>
-                <w:szCs w:val="22"/>
-                <w14:ligatures w14:val="none"/>
-              </w:rPr>
-              <w:t>Numpy</w:t>
-            </w:r>
-            <w:proofErr w:type="spellEnd"/>
-            <w:r>
-              <w:rPr>
-                <w:rFonts w:ascii="Times New Roman" w:eastAsia="Times New Roman" w:hAnsi="Times New Roman" w:cs="Times New Roman"/>
-                <w:bCs/>
-                <w:color w:val="404040"/>
-                <w:kern w:val="0"/>
-                <w:sz w:val="22"/>
-                <w:szCs w:val="22"/>
-                <w14:ligatures w14:val="none"/>
-              </w:rPr>
-              <w:t xml:space="preserve">, </w:t>
-            </w:r>
-            <w:proofErr w:type="spellStart"/>
-            <w:r>
-              <w:rPr>
-                <w:rFonts w:ascii="Times New Roman" w:eastAsia="Times New Roman" w:hAnsi="Times New Roman" w:cs="Times New Roman"/>
-                <w:bCs/>
-                <w:color w:val="404040"/>
-                <w:kern w:val="0"/>
-                <w:sz w:val="22"/>
-                <w:szCs w:val="22"/>
-                <w14:ligatures w14:val="none"/>
-              </w:rPr>
-              <w:t>Dask</w:t>
-            </w:r>
-            <w:proofErr w:type="spellEnd"/>
+            <w:r>
+              <w:rPr>
+                <w:rFonts w:ascii="Times New Roman" w:eastAsia="Times New Roman" w:hAnsi="Times New Roman" w:cs="Times New Roman"/>
+                <w:bCs/>
+                <w:color w:val="404040"/>
+                <w:kern w:val="0"/>
+                <w:sz w:val="22"/>
+                <w:szCs w:val="22"/>
+                <w14:ligatures w14:val="none"/>
+              </w:rPr>
+              <w:t>CNNs, U-Net, Swin Transformer, GANs</w:t>
+            </w:r>
+          </w:p>
+          <w:p>
+            <w:pPr>
+              <w:pStyle w:val="ListParagraph"/>
+              <w:keepNext/>
+              <w:keepLines/>
+              <w:numPr>
+                <w:ilvl w:val="0"/>
+                <w:numId w:val="2"/>
+              </w:numPr>
+              <w:spacing w:after="120" w:line="240" w:lineRule="auto"/>
+              <w:outlineLvl w:val="1"/>
+              <w:rPr>
+                <w:rFonts w:ascii="Times New Roman" w:eastAsia="Times New Roman" w:hAnsi="Times New Roman" w:cs="Times New Roman"/>
+                <w:bCs/>
+                <w:color w:val="404040"/>
+                <w:kern w:val="0"/>
+                <w:sz w:val="22"/>
+                <w:szCs w:val="22"/>
+                <w14:ligatures w14:val="none"/>
+              </w:rPr>
+            </w:pPr>
+            <w:r>
+              <w:rPr>
+                <w:rFonts w:ascii="Times New Roman" w:eastAsia="Times New Roman" w:hAnsi="Times New Roman" w:cs="Times New Roman"/>
+                <w:bCs/>
+                <w:color w:val="404040"/>
+                <w:kern w:val="0"/>
+                <w:sz w:val="22"/>
+                <w:szCs w:val="22"/>
+                <w14:ligatures w14:val="none"/>
+              </w:rPr>
+              <w:t>Statistical post-processing &amp; calibration</w:t>
+            </w:r>
+          </w:p>
+        </w:tc>
+      </w:tr>
+      <w:tr>
+        <w:tc>
+          <w:tcPr>
+            <w:tcW w:w="9350" w:type="dxa"/>
+            <w:gridSpan w:val="5"/>
+          </w:tcPr>
+          <w:p>
+            <w:pPr>
+              <w:keepNext/>
+              <w:keepLines/>
+              <w:spacing w:after="120" w:line="240" w:lineRule="auto"/>
+              <w:outlineLvl w:val="1"/>
+              <w:rPr>
+                <w:rFonts w:ascii="Times New Roman" w:eastAsia="Times New Roman" w:hAnsi="Times New Roman" w:cs="Times New Roman"/>
+                <w:bCs/>
+                <w:color w:val="404040"/>
+                <w:kern w:val="0"/>
+                <w:sz w:val="22"/>
+                <w:szCs w:val="22"/>
+                <w14:ligatures w14:val="none"/>
+              </w:rPr>
+            </w:pPr>
+            <w:r>
+              <w:rPr>
+                <w:rFonts w:ascii="Times New Roman" w:eastAsia="Times New Roman" w:hAnsi="Times New Roman" w:cs="Times New Roman"/>
+                <w:b/>
+                <w:color w:val="404040"/>
+                <w:kern w:val="0"/>
+                <w:sz w:val="22"/>
+                <w:szCs w:val="22"/>
+                <w14:ligatures w14:val="none"/>
+              </w:rPr>
+              <w:t>High-Performance Computing</w:t>
+            </w:r>
+          </w:p>
+        </w:tc>
+      </w:tr>
+      <w:tr>
+        <w:tc>
+          <w:tcPr>
+            <w:tcW w:w="9350" w:type="dxa"/>
+            <w:gridSpan w:val="5"/>
+          </w:tcPr>
+          <w:p>
+            <w:pPr>
+              <w:pStyle w:val="ListParagraph"/>
+              <w:keepNext/>
+              <w:keepLines/>
+              <w:numPr>
+                <w:ilvl w:val="0"/>
+                <w:numId w:val="2"/>
+              </w:numPr>
+              <w:spacing w:after="120" w:line="240" w:lineRule="auto"/>
+              <w:outlineLvl w:val="1"/>
+              <w:rPr>
+                <w:rFonts w:ascii="Times New Roman" w:eastAsia="Times New Roman" w:hAnsi="Times New Roman" w:cs="Times New Roman"/>
+                <w:bCs/>
+                <w:color w:val="404040"/>
+                <w:kern w:val="0"/>
+                <w:sz w:val="22"/>
+                <w:szCs w:val="22"/>
+                <w14:ligatures w14:val="none"/>
+              </w:rPr>
+            </w:pPr>
+            <w:r>
+              <w:rPr>
+                <w:rFonts w:ascii="Times New Roman" w:eastAsia="Times New Roman" w:hAnsi="Times New Roman" w:cs="Times New Roman"/>
+                <w:bCs/>
+                <w:color w:val="404040"/>
+                <w:kern w:val="0"/>
+                <w:sz w:val="22"/>
+                <w:szCs w:val="22"/>
+                <w14:ligatures w14:val="none"/>
+              </w:rPr>
+              <w:t>Multi-GPU distributed training, NVIDIA A100 environments, large-scale climate data processing</w:t>
+            </w:r>
+          </w:p>
+        </w:tc>
+      </w:tr>
+      <w:tr>
+        <w:tc>
+          <w:tcPr>
+            <w:tcW w:w="9350" w:type="dxa"/>
+            <w:gridSpan w:val="5"/>
+          </w:tcPr>
+          <w:p>
+            <w:pPr>
+              <w:keepNext/>
+              <w:keepLines/>
+              <w:spacing w:after="120" w:line="240" w:lineRule="auto"/>
+              <w:outlineLvl w:val="1"/>
+              <w:rPr>
+                <w:rFonts w:ascii="Times New Roman" w:eastAsia="Times New Roman" w:hAnsi="Times New Roman" w:cs="Times New Roman"/>
+                <w:bCs/>
+                <w:color w:val="404040"/>
+                <w:kern w:val="0"/>
+                <w:sz w:val="22"/>
+                <w:szCs w:val="22"/>
+                <w14:ligatures w14:val="none"/>
+              </w:rPr>
+            </w:pPr>
+            <w:r>
+              <w:rPr>
+                <w:rFonts w:ascii="Times New Roman" w:eastAsia="Times New Roman" w:hAnsi="Times New Roman" w:cs="Times New Roman"/>
+                <w:b/>
+                <w:color w:val="404040"/>
+                <w:kern w:val="0"/>
+                <w:sz w:val="22"/>
+                <w:szCs w:val="22"/>
+                <w14:ligatures w14:val="none"/>
+              </w:rPr>
+              <w:t>Numerical Weather Prediction</w:t>
+            </w:r>
+          </w:p>
+        </w:tc>
+      </w:tr>
+      <w:tr>
+        <w:tc>
+          <w:tcPr>
+            <w:tcW w:w="9350" w:type="dxa"/>
+            <w:gridSpan w:val="5"/>
+          </w:tcPr>
+          <w:p>
+            <w:pPr>
+              <w:pStyle w:val="ListParagraph"/>
+              <w:keepNext/>
+              <w:keepLines/>
+              <w:numPr>
+                <w:ilvl w:val="0"/>
+                <w:numId w:val="2"/>
+              </w:numPr>
+              <w:spacing w:after="120" w:line="240" w:lineRule="auto"/>
+              <w:outlineLvl w:val="1"/>
+              <w:rPr>
+                <w:rFonts w:ascii="Times New Roman" w:eastAsia="Times New Roman" w:hAnsi="Times New Roman" w:cs="Times New Roman"/>
+                <w:bCs/>
+                <w:color w:val="404040"/>
+                <w:kern w:val="0"/>
+                <w:sz w:val="22"/>
+                <w:szCs w:val="22"/>
+                <w14:ligatures w14:val="none"/>
+              </w:rPr>
+            </w:pPr>
+            <w:r>
+              <w:rPr>
+                <w:rFonts w:ascii="Times New Roman" w:eastAsia="Times New Roman" w:hAnsi="Times New Roman" w:cs="Times New Roman"/>
+                <w:bCs/>
+                <w:color w:val="404040"/>
+                <w:kern w:val="0"/>
+                <w:sz w:val="22"/>
+                <w:szCs w:val="22"/>
+                <w14:ligatures w14:val="none"/>
+              </w:rPr>
+              <w:t>WRF calibration, sensitivity analysis, data assimilation</w:t>
+            </w:r>
+          </w:p>
+          <w:p>
+            <w:pPr>
+              <w:pStyle w:val="ListParagraph"/>
+              <w:keepNext/>
+              <w:keepLines/>
+              <w:numPr>
+                <w:ilvl w:val="0"/>
+                <w:numId w:val="2"/>
+              </w:numPr>
+              <w:spacing w:after="120" w:line="240" w:lineRule="auto"/>
+              <w:outlineLvl w:val="1"/>
+              <w:rPr>
+                <w:rFonts w:ascii="Times New Roman" w:eastAsia="Times New Roman" w:hAnsi="Times New Roman" w:cs="Times New Roman"/>
+                <w:bCs/>
+                <w:color w:val="404040"/>
+                <w:kern w:val="0"/>
+                <w:sz w:val="22"/>
+                <w:szCs w:val="22"/>
+                <w14:ligatures w14:val="none"/>
+              </w:rPr>
+            </w:pPr>
+            <w:r>
+              <w:rPr>
+                <w:rFonts w:ascii="Times New Roman" w:eastAsia="Times New Roman" w:hAnsi="Times New Roman" w:cs="Times New Roman"/>
+                <w:bCs/>
+                <w:color w:val="404040"/>
+                <w:kern w:val="0"/>
+                <w:sz w:val="22"/>
+                <w:szCs w:val="22"/>
+                <w14:ligatures w14:val="none"/>
+              </w:rPr>
+              <w:t>Reanalysis &amp; regional climate products (ERA5, CERRA, ICON, CONUS404, EDDEv2, URMA)</w:t>
+            </w:r>
           </w:p>
         </w:tc>
       </w:tr>
@@ -3470,13 +3705,48 @@
             <w:r>
               <w:rPr>
                 <w:rFonts w:ascii="Times New Roman" w:eastAsia="Gill Sans MT" w:hAnsi="Times New Roman" w:cs="Times New Roman"/>
+                <w:b/>
+                <w:bCs/>
                 <w:color w:val="000000"/>
                 <w:kern w:val="0"/>
                 <w:sz w:val="22"/>
                 <w:szCs w:val="22"/>
                 <w14:ligatures w14:val="none"/>
               </w:rPr>
-              <w:t>Google Scholar Citations: https://scholar.google.com/citations?user=2q-QsUIAAAAJ&amp;hl=en&amp;authuser=1</w:t>
+              <w:t>Google Scholar Citations</w:t>
+            </w:r>
+            <w:r>
+              <w:rPr>
+                <w:rFonts w:ascii="Times New Roman" w:eastAsia="Gill Sans MT" w:hAnsi="Times New Roman" w:cs="Times New Roman"/>
+                <w:color w:val="000000"/>
+                <w:kern w:val="0"/>
+                <w:sz w:val="22"/>
+                <w:szCs w:val="22"/>
+                <w14:ligatures w14:val="none"/>
+              </w:rPr>
+              <w:t>: https://scholar.google.com/citations?user=2q</w:t>
+            </w:r>
+            <w:r>
+              <w:rPr>
+                <w:rFonts w:ascii="Times New Roman" w:eastAsia="Gill Sans MT" w:hAnsi="Times New Roman" w:cs="Times New Roman"/>
+                <w:color w:val="000000"/>
+                <w:kern w:val="0"/>
+                <w:sz w:val="22"/>
+                <w:szCs w:val="22"/>
+                <w14:ligatures w14:val="none"/>
+              </w:rPr>
+              <w:t>-</w:t>
+            </w:r>
+            <w:r>
+              <w:rPr>
+                <w:rFonts w:ascii="Times New Roman" w:eastAsia="Gill Sans MT" w:hAnsi="Times New Roman" w:cs="Times New Roman"/>
+                <w:color w:val="000000"/>
+                <w:kern w:val="0"/>
+                <w:sz w:val="22"/>
+                <w:szCs w:val="22"/>
+                <w14:ligatures w14:val="none"/>
+              </w:rPr>
+              <w:t>QsUIAAAAJ&amp;hl=en&amp;authuser=1</w:t>
             </w:r>
           </w:p>
           <w:p>
@@ -3494,13 +3764,26 @@
             <w:r>
               <w:rPr>
                 <w:rFonts w:ascii="Times New Roman" w:eastAsia="Gill Sans MT" w:hAnsi="Times New Roman" w:cs="Times New Roman"/>
+                <w:b/>
+                <w:bCs/>
                 <w:color w:val="000000"/>
                 <w:kern w:val="0"/>
                 <w:sz w:val="22"/>
                 <w:szCs w:val="22"/>
                 <w14:ligatures w14:val="none"/>
               </w:rPr>
-              <w:t>ResearchGate Page: https://www.researchgate.net/profile/Harish-Baki</w:t>
+              <w:t>ResearchGate Page</w:t>
+            </w:r>
+            <w:r>
+              <w:rPr>
+                <w:rFonts w:ascii="Times New Roman" w:eastAsia="Gill Sans MT" w:hAnsi="Times New Roman" w:cs="Times New Roman"/>
+                <w:color w:val="000000"/>
+                <w:kern w:val="0"/>
+                <w:sz w:val="22"/>
+                <w:szCs w:val="22"/>
+                <w14:ligatures w14:val="none"/>
+              </w:rPr>
+              <w:t>: https://www.researchgate.net/profile/Harish-Baki</w:t>
             </w:r>
           </w:p>
           <w:p>
@@ -3518,13 +3801,26 @@
             <w:r>
               <w:rPr>
                 <w:rFonts w:ascii="Times New Roman" w:eastAsia="Gill Sans MT" w:hAnsi="Times New Roman" w:cs="Times New Roman"/>
+                <w:b/>
+                <w:bCs/>
                 <w:color w:val="000000"/>
                 <w:kern w:val="0"/>
                 <w:sz w:val="22"/>
                 <w:szCs w:val="22"/>
                 <w14:ligatures w14:val="none"/>
               </w:rPr>
-              <w:t>ORCID: 0000-0003-1956-8280</w:t>
+              <w:t>ORCID</w:t>
+            </w:r>
+            <w:r>
+              <w:rPr>
+                <w:rFonts w:ascii="Times New Roman" w:eastAsia="Gill Sans MT" w:hAnsi="Times New Roman" w:cs="Times New Roman"/>
+                <w:color w:val="000000"/>
+                <w:kern w:val="0"/>
+                <w:sz w:val="22"/>
+                <w:szCs w:val="22"/>
+                <w14:ligatures w14:val="none"/>
+              </w:rPr>
+              <w:t>: 0000-0003-1956-8280</w:t>
             </w:r>
           </w:p>
           <w:p>
@@ -3542,13 +3838,26 @@
             <w:r>
               <w:rPr>
                 <w:rFonts w:ascii="Times New Roman" w:eastAsia="Gill Sans MT" w:hAnsi="Times New Roman" w:cs="Times New Roman"/>
+                <w:b/>
+                <w:bCs/>
                 <w:color w:val="000000"/>
                 <w:kern w:val="0"/>
                 <w:sz w:val="22"/>
                 <w:szCs w:val="22"/>
                 <w14:ligatures w14:val="none"/>
               </w:rPr>
-              <w:t>SCOPUS: 57226340925</w:t>
+              <w:t>SCOPUS</w:t>
+            </w:r>
+            <w:r>
+              <w:rPr>
+                <w:rFonts w:ascii="Times New Roman" w:eastAsia="Gill Sans MT" w:hAnsi="Times New Roman" w:cs="Times New Roman"/>
+                <w:color w:val="000000"/>
+                <w:kern w:val="0"/>
+                <w:sz w:val="22"/>
+                <w:szCs w:val="22"/>
+                <w14:ligatures w14:val="none"/>
+              </w:rPr>
+              <w:t>: 57226340925</w:t>
             </w:r>
           </w:p>
         </w:tc>
@@ -3782,7 +4091,6 @@
                 <w:szCs w:val="22"/>
                 <w14:ligatures w14:val="none"/>
               </w:rPr>
-              <w:lastRenderedPageBreak/>
               <w:t>[1</w:t>
             </w:r>
             <w:r>
@@ -4619,6 +4927,7 @@
                 <w:szCs w:val="22"/>
                 <w14:ligatures w14:val="none"/>
               </w:rPr>
+              <w:lastRenderedPageBreak/>
               <w:t>[10</w:t>
             </w:r>
             <w:r>
@@ -6409,17 +6718,7 @@
                 <w:szCs w:val="22"/>
                 <w:lang w:val="en"/>
               </w:rPr>
-              <w:t xml:space="preserve">B. (2021). A sensitivity study of WRF model microphysics and cumulus parameterization schemes for the simulations of tropical cyclones using </w:t>
-            </w:r>
-            <w:r>
-              <w:rPr>
-                <w:rFonts w:ascii="Times New Roman" w:hAnsi="Times New Roman" w:cs="Times New Roman"/>
-                <w:sz w:val="22"/>
-                <w:szCs w:val="22"/>
-                <w:lang w:val="en"/>
-              </w:rPr>
-              <w:lastRenderedPageBreak/>
-              <w:t xml:space="preserve">GPM radar data, </w:t>
+              <w:t xml:space="preserve">B. (2021). A sensitivity study of WRF model microphysics and cumulus parameterization schemes for the simulations of tropical cyclones using GPM radar data, </w:t>
             </w:r>
             <w:r>
               <w:rPr>
@@ -6519,7 +6818,6 @@
                 <w:szCs w:val="22"/>
                 <w14:ligatures w14:val="none"/>
               </w:rPr>
-              <w:lastRenderedPageBreak/>
               <w:t>[</w:t>
             </w:r>
             <w:r>
@@ -7201,7 +7499,16 @@
                 <w:sz w:val="22"/>
                 <w:szCs w:val="22"/>
               </w:rPr>
-              <w:t xml:space="preserve">. Gordon Research Conference - </w:t>
+              <w:t xml:space="preserve">. </w:t>
+            </w:r>
+            <w:r>
+              <w:rPr>
+                <w:rFonts w:ascii="Times New Roman" w:hAnsi="Times New Roman" w:cs="Times New Roman"/>
+                <w:sz w:val="22"/>
+                <w:szCs w:val="22"/>
+              </w:rPr>
+              <w:lastRenderedPageBreak/>
+              <w:t xml:space="preserve">Gordon Research Conference - </w:t>
             </w:r>
             <w:r>
               <w:rPr>
@@ -7270,6 +7577,7 @@
                 <w:szCs w:val="22"/>
                 <w14:ligatures w14:val="none"/>
               </w:rPr>
+              <w:lastRenderedPageBreak/>
               <w:t>[</w:t>
             </w:r>
             <w:r>
@@ -8660,7 +8968,6 @@
                 <w:szCs w:val="22"/>
                 <w14:ligatures w14:val="none"/>
               </w:rPr>
-              <w:lastRenderedPageBreak/>
               <w:t>[</w:t>
             </w:r>
             <w:r>
@@ -9388,6 +9695,7 @@
                 <w:szCs w:val="22"/>
                 <w14:ligatures w14:val="none"/>
               </w:rPr>
+              <w:lastRenderedPageBreak/>
               <w:t>Conducted hands-on training on NVIDIA A100 GPU resources, focusing on multi-GPU execution and development of deep-learning frameworks for wind-gust downscaling</w:t>
             </w:r>
           </w:p>
@@ -9543,19 +9851,245 @@
     </w:lvl>
   </w:abstractNum>
   <w:abstractNum w:abstractNumId="1" w15:restartNumberingAfterBreak="0">
-    <w:nsid w:val="0E394008"/>
+    <w:nsid w:val="057E64F4"/>
     <w:multiLevelType w:val="hybridMultilevel"/>
-    <w:tmpl w:val="CDF4AB20"/>
+    <w:tmpl w:val="57E6A8CE"/>
+    <w:lvl w:ilvl="0" w:tplc="D68084EE">
+      <w:start w:val="5"/>
+      <w:numFmt w:val="bullet"/>
+      <w:lvlText w:val="-"/>
+      <w:lvlJc w:val="left"/>
+      <w:pPr>
+        <w:ind w:left="720" w:hanging="360"/>
+      </w:pPr>
+      <w:rPr>
+        <w:rFonts w:ascii="Gill Sans MT" w:eastAsia="Gill Sans MT" w:hAnsi="Gill Sans MT" w:cs="Times New Roman" w:hint="default"/>
+      </w:rPr>
+    </w:lvl>
+    <w:lvl w:ilvl="1" w:tplc="04090003" w:tentative="1">
+      <w:start w:val="1"/>
+      <w:numFmt w:val="bullet"/>
+      <w:lvlText w:val="o"/>
+      <w:lvlJc w:val="left"/>
+      <w:pPr>
+        <w:ind w:left="1440" w:hanging="360"/>
+      </w:pPr>
+      <w:rPr>
+        <w:rFonts w:ascii="Courier New" w:hAnsi="Courier New" w:hint="default"/>
+      </w:rPr>
+    </w:lvl>
+    <w:lvl w:ilvl="2" w:tplc="04090005" w:tentative="1">
+      <w:start w:val="1"/>
+      <w:numFmt w:val="bullet"/>
+      <w:lvlText w:val=""/>
+      <w:lvlJc w:val="left"/>
+      <w:pPr>
+        <w:ind w:left="2160" w:hanging="360"/>
+      </w:pPr>
+      <w:rPr>
+        <w:rFonts w:ascii="Wingdings" w:hAnsi="Wingdings" w:hint="default"/>
+      </w:rPr>
+    </w:lvl>
+    <w:lvl w:ilvl="3" w:tplc="04090001" w:tentative="1">
+      <w:start w:val="1"/>
+      <w:numFmt w:val="bullet"/>
+      <w:lvlText w:val=""/>
+      <w:lvlJc w:val="left"/>
+      <w:pPr>
+        <w:ind w:left="2880" w:hanging="360"/>
+      </w:pPr>
+      <w:rPr>
+        <w:rFonts w:ascii="Symbol" w:hAnsi="Symbol" w:hint="default"/>
+      </w:rPr>
+    </w:lvl>
+    <w:lvl w:ilvl="4" w:tplc="04090003" w:tentative="1">
+      <w:start w:val="1"/>
+      <w:numFmt w:val="bullet"/>
+      <w:lvlText w:val="o"/>
+      <w:lvlJc w:val="left"/>
+      <w:pPr>
+        <w:ind w:left="3600" w:hanging="360"/>
+      </w:pPr>
+      <w:rPr>
+        <w:rFonts w:ascii="Courier New" w:hAnsi="Courier New" w:hint="default"/>
+      </w:rPr>
+    </w:lvl>
+    <w:lvl w:ilvl="5" w:tplc="04090005" w:tentative="1">
+      <w:start w:val="1"/>
+      <w:numFmt w:val="bullet"/>
+      <w:lvlText w:val=""/>
+      <w:lvlJc w:val="left"/>
+      <w:pPr>
+        <w:ind w:left="4320" w:hanging="360"/>
+      </w:pPr>
+      <w:rPr>
+        <w:rFonts w:ascii="Wingdings" w:hAnsi="Wingdings" w:hint="default"/>
+      </w:rPr>
+    </w:lvl>
+    <w:lvl w:ilvl="6" w:tplc="04090001" w:tentative="1">
+      <w:start w:val="1"/>
+      <w:numFmt w:val="bullet"/>
+      <w:lvlText w:val=""/>
+      <w:lvlJc w:val="left"/>
+      <w:pPr>
+        <w:ind w:left="5040" w:hanging="360"/>
+      </w:pPr>
+      <w:rPr>
+        <w:rFonts w:ascii="Symbol" w:hAnsi="Symbol" w:hint="default"/>
+      </w:rPr>
+    </w:lvl>
+    <w:lvl w:ilvl="7" w:tplc="04090003" w:tentative="1">
+      <w:start w:val="1"/>
+      <w:numFmt w:val="bullet"/>
+      <w:lvlText w:val="o"/>
+      <w:lvlJc w:val="left"/>
+      <w:pPr>
+        <w:ind w:left="5760" w:hanging="360"/>
+      </w:pPr>
+      <w:rPr>
+        <w:rFonts w:ascii="Courier New" w:hAnsi="Courier New" w:hint="default"/>
+      </w:rPr>
+    </w:lvl>
+    <w:lvl w:ilvl="8" w:tplc="04090005" w:tentative="1">
+      <w:start w:val="1"/>
+      <w:numFmt w:val="bullet"/>
+      <w:lvlText w:val=""/>
+      <w:lvlJc w:val="left"/>
+      <w:pPr>
+        <w:ind w:left="6480" w:hanging="360"/>
+      </w:pPr>
+      <w:rPr>
+        <w:rFonts w:ascii="Wingdings" w:hAnsi="Wingdings" w:hint="default"/>
+      </w:rPr>
+    </w:lvl>
+  </w:abstractNum>
+  <w:abstractNum w:abstractNumId="2" w15:restartNumberingAfterBreak="0">
+    <w:nsid w:val="07462CB9"/>
+    <w:multiLevelType w:val="hybridMultilevel"/>
+    <w:tmpl w:val="FF9EDE38"/>
     <w:lvl w:ilvl="0" w:tplc="04090001">
       <w:start w:val="1"/>
       <w:numFmt w:val="bullet"/>
       <w:lvlText w:val=""/>
       <w:lvlJc w:val="left"/>
       <w:pPr>
+        <w:ind w:left="720" w:hanging="360"/>
+      </w:pPr>
+      <w:rPr>
+        <w:rFonts w:ascii="Symbol" w:hAnsi="Symbol" w:hint="default"/>
+      </w:rPr>
+    </w:lvl>
+    <w:lvl w:ilvl="1" w:tplc="04090003" w:tentative="1">
+      <w:start w:val="1"/>
+      <w:numFmt w:val="bullet"/>
+      <w:lvlText w:val="o"/>
+      <w:lvlJc w:val="left"/>
+      <w:pPr>
+        <w:ind w:left="1440" w:hanging="360"/>
+      </w:pPr>
+      <w:rPr>
+        <w:rFonts w:ascii="Courier New" w:hAnsi="Courier New" w:hint="default"/>
+      </w:rPr>
+    </w:lvl>
+    <w:lvl w:ilvl="2" w:tplc="04090005" w:tentative="1">
+      <w:start w:val="1"/>
+      <w:numFmt w:val="bullet"/>
+      <w:lvlText w:val=""/>
+      <w:lvlJc w:val="left"/>
+      <w:pPr>
+        <w:ind w:left="2160" w:hanging="360"/>
+      </w:pPr>
+      <w:rPr>
+        <w:rFonts w:ascii="Wingdings" w:hAnsi="Wingdings" w:hint="default"/>
+      </w:rPr>
+    </w:lvl>
+    <w:lvl w:ilvl="3" w:tplc="04090001" w:tentative="1">
+      <w:start w:val="1"/>
+      <w:numFmt w:val="bullet"/>
+      <w:lvlText w:val=""/>
+      <w:lvlJc w:val="left"/>
+      <w:pPr>
+        <w:ind w:left="2880" w:hanging="360"/>
+      </w:pPr>
+      <w:rPr>
+        <w:rFonts w:ascii="Symbol" w:hAnsi="Symbol" w:hint="default"/>
+      </w:rPr>
+    </w:lvl>
+    <w:lvl w:ilvl="4" w:tplc="04090003" w:tentative="1">
+      <w:start w:val="1"/>
+      <w:numFmt w:val="bullet"/>
+      <w:lvlText w:val="o"/>
+      <w:lvlJc w:val="left"/>
+      <w:pPr>
+        <w:ind w:left="3600" w:hanging="360"/>
+      </w:pPr>
+      <w:rPr>
+        <w:rFonts w:ascii="Courier New" w:hAnsi="Courier New" w:hint="default"/>
+      </w:rPr>
+    </w:lvl>
+    <w:lvl w:ilvl="5" w:tplc="04090005" w:tentative="1">
+      <w:start w:val="1"/>
+      <w:numFmt w:val="bullet"/>
+      <w:lvlText w:val=""/>
+      <w:lvlJc w:val="left"/>
+      <w:pPr>
+        <w:ind w:left="4320" w:hanging="360"/>
+      </w:pPr>
+      <w:rPr>
+        <w:rFonts w:ascii="Wingdings" w:hAnsi="Wingdings" w:hint="default"/>
+      </w:rPr>
+    </w:lvl>
+    <w:lvl w:ilvl="6" w:tplc="04090001" w:tentative="1">
+      <w:start w:val="1"/>
+      <w:numFmt w:val="bullet"/>
+      <w:lvlText w:val=""/>
+      <w:lvlJc w:val="left"/>
+      <w:pPr>
+        <w:ind w:left="5040" w:hanging="360"/>
+      </w:pPr>
+      <w:rPr>
+        <w:rFonts w:ascii="Symbol" w:hAnsi="Symbol" w:hint="default"/>
+      </w:rPr>
+    </w:lvl>
+    <w:lvl w:ilvl="7" w:tplc="04090003" w:tentative="1">
+      <w:start w:val="1"/>
+      <w:numFmt w:val="bullet"/>
+      <w:lvlText w:val="o"/>
+      <w:lvlJc w:val="left"/>
+      <w:pPr>
+        <w:ind w:left="5760" w:hanging="360"/>
+      </w:pPr>
+      <w:rPr>
+        <w:rFonts w:ascii="Courier New" w:hAnsi="Courier New" w:hint="default"/>
+      </w:rPr>
+    </w:lvl>
+    <w:lvl w:ilvl="8" w:tplc="04090005" w:tentative="1">
+      <w:start w:val="1"/>
+      <w:numFmt w:val="bullet"/>
+      <w:lvlText w:val=""/>
+      <w:lvlJc w:val="left"/>
+      <w:pPr>
+        <w:ind w:left="6480" w:hanging="360"/>
+      </w:pPr>
+      <w:rPr>
+        <w:rFonts w:ascii="Wingdings" w:hAnsi="Wingdings" w:hint="default"/>
+      </w:rPr>
+    </w:lvl>
+  </w:abstractNum>
+  <w:abstractNum w:abstractNumId="3" w15:restartNumberingAfterBreak="0">
+    <w:nsid w:val="0E394008"/>
+    <w:multiLevelType w:val="hybridMultilevel"/>
+    <w:tmpl w:val="7CF667B8"/>
+    <w:lvl w:ilvl="0" w:tplc="D68084EE">
+      <w:start w:val="5"/>
+      <w:numFmt w:val="bullet"/>
+      <w:lvlText w:val="-"/>
+      <w:lvlJc w:val="left"/>
+      <w:pPr>
         <w:ind w:left="630" w:hanging="360"/>
       </w:pPr>
       <w:rPr>
-        <w:rFonts w:ascii="Symbol" w:hAnsi="Symbol" w:hint="default"/>
+        <w:rFonts w:ascii="Gill Sans MT" w:eastAsia="Gill Sans MT" w:hAnsi="Gill Sans MT" w:cs="Times New Roman" w:hint="default"/>
       </w:rPr>
     </w:lvl>
     <w:lvl w:ilvl="1" w:tplc="FFFFFFFF">
@@ -9655,7 +10189,7 @@
       </w:rPr>
     </w:lvl>
   </w:abstractNum>
-  <w:abstractNum w:abstractNumId="2" w15:restartNumberingAfterBreak="0">
+  <w:abstractNum w:abstractNumId="4" w15:restartNumberingAfterBreak="0">
     <w:nsid w:val="10483DD0"/>
     <w:multiLevelType w:val="hybridMultilevel"/>
     <w:tmpl w:val="2DBCE026"/>
@@ -9744,7 +10278,346 @@
       </w:pPr>
     </w:lvl>
   </w:abstractNum>
-  <w:abstractNum w:abstractNumId="3" w15:restartNumberingAfterBreak="0">
+  <w:abstractNum w:abstractNumId="5" w15:restartNumberingAfterBreak="0">
+    <w:nsid w:val="1E5E3089"/>
+    <w:multiLevelType w:val="hybridMultilevel"/>
+    <w:tmpl w:val="6220011C"/>
+    <w:lvl w:ilvl="0" w:tplc="04090001">
+      <w:start w:val="1"/>
+      <w:numFmt w:val="bullet"/>
+      <w:lvlText w:val=""/>
+      <w:lvlJc w:val="left"/>
+      <w:pPr>
+        <w:ind w:left="720" w:hanging="360"/>
+      </w:pPr>
+      <w:rPr>
+        <w:rFonts w:ascii="Symbol" w:hAnsi="Symbol" w:hint="default"/>
+      </w:rPr>
+    </w:lvl>
+    <w:lvl w:ilvl="1" w:tplc="04090003" w:tentative="1">
+      <w:start w:val="1"/>
+      <w:numFmt w:val="bullet"/>
+      <w:lvlText w:val="o"/>
+      <w:lvlJc w:val="left"/>
+      <w:pPr>
+        <w:ind w:left="1440" w:hanging="360"/>
+      </w:pPr>
+      <w:rPr>
+        <w:rFonts w:ascii="Courier New" w:hAnsi="Courier New" w:hint="default"/>
+      </w:rPr>
+    </w:lvl>
+    <w:lvl w:ilvl="2" w:tplc="04090005" w:tentative="1">
+      <w:start w:val="1"/>
+      <w:numFmt w:val="bullet"/>
+      <w:lvlText w:val=""/>
+      <w:lvlJc w:val="left"/>
+      <w:pPr>
+        <w:ind w:left="2160" w:hanging="360"/>
+      </w:pPr>
+      <w:rPr>
+        <w:rFonts w:ascii="Wingdings" w:hAnsi="Wingdings" w:hint="default"/>
+      </w:rPr>
+    </w:lvl>
+    <w:lvl w:ilvl="3" w:tplc="04090001" w:tentative="1">
+      <w:start w:val="1"/>
+      <w:numFmt w:val="bullet"/>
+      <w:lvlText w:val=""/>
+      <w:lvlJc w:val="left"/>
+      <w:pPr>
+        <w:ind w:left="2880" w:hanging="360"/>
+      </w:pPr>
+      <w:rPr>
+        <w:rFonts w:ascii="Symbol" w:hAnsi="Symbol" w:hint="default"/>
+      </w:rPr>
+    </w:lvl>
+    <w:lvl w:ilvl="4" w:tplc="04090003" w:tentative="1">
+      <w:start w:val="1"/>
+      <w:numFmt w:val="bullet"/>
+      <w:lvlText w:val="o"/>
+      <w:lvlJc w:val="left"/>
+      <w:pPr>
+        <w:ind w:left="3600" w:hanging="360"/>
+      </w:pPr>
+      <w:rPr>
+        <w:rFonts w:ascii="Courier New" w:hAnsi="Courier New" w:hint="default"/>
+      </w:rPr>
+    </w:lvl>
+    <w:lvl w:ilvl="5" w:tplc="04090005" w:tentative="1">
+      <w:start w:val="1"/>
+      <w:numFmt w:val="bullet"/>
+      <w:lvlText w:val=""/>
+      <w:lvlJc w:val="left"/>
+      <w:pPr>
+        <w:ind w:left="4320" w:hanging="360"/>
+      </w:pPr>
+      <w:rPr>
+        <w:rFonts w:ascii="Wingdings" w:hAnsi="Wingdings" w:hint="default"/>
+      </w:rPr>
+    </w:lvl>
+    <w:lvl w:ilvl="6" w:tplc="04090001" w:tentative="1">
+      <w:start w:val="1"/>
+      <w:numFmt w:val="bullet"/>
+      <w:lvlText w:val=""/>
+      <w:lvlJc w:val="left"/>
+      <w:pPr>
+        <w:ind w:left="5040" w:hanging="360"/>
+      </w:pPr>
+      <w:rPr>
+        <w:rFonts w:ascii="Symbol" w:hAnsi="Symbol" w:hint="default"/>
+      </w:rPr>
+    </w:lvl>
+    <w:lvl w:ilvl="7" w:tplc="04090003" w:tentative="1">
+      <w:start w:val="1"/>
+      <w:numFmt w:val="bullet"/>
+      <w:lvlText w:val="o"/>
+      <w:lvlJc w:val="left"/>
+      <w:pPr>
+        <w:ind w:left="5760" w:hanging="360"/>
+      </w:pPr>
+      <w:rPr>
+        <w:rFonts w:ascii="Courier New" w:hAnsi="Courier New" w:hint="default"/>
+      </w:rPr>
+    </w:lvl>
+    <w:lvl w:ilvl="8" w:tplc="04090005" w:tentative="1">
+      <w:start w:val="1"/>
+      <w:numFmt w:val="bullet"/>
+      <w:lvlText w:val=""/>
+      <w:lvlJc w:val="left"/>
+      <w:pPr>
+        <w:ind w:left="6480" w:hanging="360"/>
+      </w:pPr>
+      <w:rPr>
+        <w:rFonts w:ascii="Wingdings" w:hAnsi="Wingdings" w:hint="default"/>
+      </w:rPr>
+    </w:lvl>
+  </w:abstractNum>
+  <w:abstractNum w:abstractNumId="6" w15:restartNumberingAfterBreak="0">
+    <w:nsid w:val="2779145B"/>
+    <w:multiLevelType w:val="hybridMultilevel"/>
+    <w:tmpl w:val="052846B0"/>
+    <w:lvl w:ilvl="0" w:tplc="D68084EE">
+      <w:start w:val="5"/>
+      <w:numFmt w:val="bullet"/>
+      <w:lvlText w:val="-"/>
+      <w:lvlJc w:val="left"/>
+      <w:pPr>
+        <w:ind w:left="630" w:hanging="360"/>
+      </w:pPr>
+      <w:rPr>
+        <w:rFonts w:ascii="Gill Sans MT" w:eastAsia="Gill Sans MT" w:hAnsi="Gill Sans MT" w:cs="Times New Roman" w:hint="default"/>
+      </w:rPr>
+    </w:lvl>
+    <w:lvl w:ilvl="1" w:tplc="FFFFFFFF" w:tentative="1">
+      <w:start w:val="1"/>
+      <w:numFmt w:val="bullet"/>
+      <w:lvlText w:val="o"/>
+      <w:lvlJc w:val="left"/>
+      <w:pPr>
+        <w:ind w:left="1440" w:hanging="360"/>
+      </w:pPr>
+      <w:rPr>
+        <w:rFonts w:ascii="Courier New" w:hAnsi="Courier New" w:hint="default"/>
+      </w:rPr>
+    </w:lvl>
+    <w:lvl w:ilvl="2" w:tplc="FFFFFFFF" w:tentative="1">
+      <w:start w:val="1"/>
+      <w:numFmt w:val="bullet"/>
+      <w:lvlText w:val=""/>
+      <w:lvlJc w:val="left"/>
+      <w:pPr>
+        <w:ind w:left="2160" w:hanging="360"/>
+      </w:pPr>
+      <w:rPr>
+        <w:rFonts w:ascii="Wingdings" w:hAnsi="Wingdings" w:hint="default"/>
+      </w:rPr>
+    </w:lvl>
+    <w:lvl w:ilvl="3" w:tplc="FFFFFFFF" w:tentative="1">
+      <w:start w:val="1"/>
+      <w:numFmt w:val="bullet"/>
+      <w:lvlText w:val=""/>
+      <w:lvlJc w:val="left"/>
+      <w:pPr>
+        <w:ind w:left="2880" w:hanging="360"/>
+      </w:pPr>
+      <w:rPr>
+        <w:rFonts w:ascii="Symbol" w:hAnsi="Symbol" w:hint="default"/>
+      </w:rPr>
+    </w:lvl>
+    <w:lvl w:ilvl="4" w:tplc="FFFFFFFF" w:tentative="1">
+      <w:start w:val="1"/>
+      <w:numFmt w:val="bullet"/>
+      <w:lvlText w:val="o"/>
+      <w:lvlJc w:val="left"/>
+      <w:pPr>
+        <w:ind w:left="3600" w:hanging="360"/>
+      </w:pPr>
+      <w:rPr>
+        <w:rFonts w:ascii="Courier New" w:hAnsi="Courier New" w:hint="default"/>
+      </w:rPr>
+    </w:lvl>
+    <w:lvl w:ilvl="5" w:tplc="FFFFFFFF" w:tentative="1">
+      <w:start w:val="1"/>
+      <w:numFmt w:val="bullet"/>
+      <w:lvlText w:val=""/>
+      <w:lvlJc w:val="left"/>
+      <w:pPr>
+        <w:ind w:left="4320" w:hanging="360"/>
+      </w:pPr>
+      <w:rPr>
+        <w:rFonts w:ascii="Wingdings" w:hAnsi="Wingdings" w:hint="default"/>
+      </w:rPr>
+    </w:lvl>
+    <w:lvl w:ilvl="6" w:tplc="FFFFFFFF" w:tentative="1">
+      <w:start w:val="1"/>
+      <w:numFmt w:val="bullet"/>
+      <w:lvlText w:val=""/>
+      <w:lvlJc w:val="left"/>
+      <w:pPr>
+        <w:ind w:left="5040" w:hanging="360"/>
+      </w:pPr>
+      <w:rPr>
+        <w:rFonts w:ascii="Symbol" w:hAnsi="Symbol" w:hint="default"/>
+      </w:rPr>
+    </w:lvl>
+    <w:lvl w:ilvl="7" w:tplc="FFFFFFFF" w:tentative="1">
+      <w:start w:val="1"/>
+      <w:numFmt w:val="bullet"/>
+      <w:lvlText w:val="o"/>
+      <w:lvlJc w:val="left"/>
+      <w:pPr>
+        <w:ind w:left="5760" w:hanging="360"/>
+      </w:pPr>
+      <w:rPr>
+        <w:rFonts w:ascii="Courier New" w:hAnsi="Courier New" w:hint="default"/>
+      </w:rPr>
+    </w:lvl>
+    <w:lvl w:ilvl="8" w:tplc="FFFFFFFF" w:tentative="1">
+      <w:start w:val="1"/>
+      <w:numFmt w:val="bullet"/>
+      <w:lvlText w:val=""/>
+      <w:lvlJc w:val="left"/>
+      <w:pPr>
+        <w:ind w:left="6480" w:hanging="360"/>
+      </w:pPr>
+      <w:rPr>
+        <w:rFonts w:ascii="Wingdings" w:hAnsi="Wingdings" w:hint="default"/>
+      </w:rPr>
+    </w:lvl>
+  </w:abstractNum>
+  <w:abstractNum w:abstractNumId="7" w15:restartNumberingAfterBreak="0">
+    <w:nsid w:val="38886E9A"/>
+    <w:multiLevelType w:val="hybridMultilevel"/>
+    <w:tmpl w:val="2BDC1830"/>
+    <w:lvl w:ilvl="0" w:tplc="D68084EE">
+      <w:start w:val="5"/>
+      <w:numFmt w:val="bullet"/>
+      <w:lvlText w:val="-"/>
+      <w:lvlJc w:val="left"/>
+      <w:pPr>
+        <w:ind w:left="720" w:hanging="360"/>
+      </w:pPr>
+      <w:rPr>
+        <w:rFonts w:ascii="Gill Sans MT" w:eastAsia="Gill Sans MT" w:hAnsi="Gill Sans MT" w:cs="Times New Roman" w:hint="default"/>
+      </w:rPr>
+    </w:lvl>
+    <w:lvl w:ilvl="1" w:tplc="FFFFFFFF" w:tentative="1">
+      <w:start w:val="1"/>
+      <w:numFmt w:val="bullet"/>
+      <w:lvlText w:val="o"/>
+      <w:lvlJc w:val="left"/>
+      <w:pPr>
+        <w:ind w:left="1440" w:hanging="360"/>
+      </w:pPr>
+      <w:rPr>
+        <w:rFonts w:ascii="Courier New" w:hAnsi="Courier New" w:hint="default"/>
+      </w:rPr>
+    </w:lvl>
+    <w:lvl w:ilvl="2" w:tplc="FFFFFFFF" w:tentative="1">
+      <w:start w:val="1"/>
+      <w:numFmt w:val="bullet"/>
+      <w:lvlText w:val=""/>
+      <w:lvlJc w:val="left"/>
+      <w:pPr>
+        <w:ind w:left="2160" w:hanging="360"/>
+      </w:pPr>
+      <w:rPr>
+        <w:rFonts w:ascii="Wingdings" w:hAnsi="Wingdings" w:hint="default"/>
+      </w:rPr>
+    </w:lvl>
+    <w:lvl w:ilvl="3" w:tplc="FFFFFFFF" w:tentative="1">
+      <w:start w:val="1"/>
+      <w:numFmt w:val="bullet"/>
+      <w:lvlText w:val=""/>
+      <w:lvlJc w:val="left"/>
+      <w:pPr>
+        <w:ind w:left="2880" w:hanging="360"/>
+      </w:pPr>
+      <w:rPr>
+        <w:rFonts w:ascii="Symbol" w:hAnsi="Symbol" w:hint="default"/>
+      </w:rPr>
+    </w:lvl>
+    <w:lvl w:ilvl="4" w:tplc="FFFFFFFF" w:tentative="1">
+      <w:start w:val="1"/>
+      <w:numFmt w:val="bullet"/>
+      <w:lvlText w:val="o"/>
+      <w:lvlJc w:val="left"/>
+      <w:pPr>
+        <w:ind w:left="3600" w:hanging="360"/>
+      </w:pPr>
+      <w:rPr>
+        <w:rFonts w:ascii="Courier New" w:hAnsi="Courier New" w:hint="default"/>
+      </w:rPr>
+    </w:lvl>
+    <w:lvl w:ilvl="5" w:tplc="FFFFFFFF" w:tentative="1">
+      <w:start w:val="1"/>
+      <w:numFmt w:val="bullet"/>
+      <w:lvlText w:val=""/>
+      <w:lvlJc w:val="left"/>
+      <w:pPr>
+        <w:ind w:left="4320" w:hanging="360"/>
+      </w:pPr>
+      <w:rPr>
+        <w:rFonts w:ascii="Wingdings" w:hAnsi="Wingdings" w:hint="default"/>
+      </w:rPr>
+    </w:lvl>
+    <w:lvl w:ilvl="6" w:tplc="FFFFFFFF" w:tentative="1">
+      <w:start w:val="1"/>
+      <w:numFmt w:val="bullet"/>
+      <w:lvlText w:val=""/>
+      <w:lvlJc w:val="left"/>
+      <w:pPr>
+        <w:ind w:left="5040" w:hanging="360"/>
+      </w:pPr>
+      <w:rPr>
+        <w:rFonts w:ascii="Symbol" w:hAnsi="Symbol" w:hint="default"/>
+      </w:rPr>
+    </w:lvl>
+    <w:lvl w:ilvl="7" w:tplc="FFFFFFFF" w:tentative="1">
+      <w:start w:val="1"/>
+      <w:numFmt w:val="bullet"/>
+      <w:lvlText w:val="o"/>
+      <w:lvlJc w:val="left"/>
+      <w:pPr>
+        <w:ind w:left="5760" w:hanging="360"/>
+      </w:pPr>
+      <w:rPr>
+        <w:rFonts w:ascii="Courier New" w:hAnsi="Courier New" w:hint="default"/>
+      </w:rPr>
+    </w:lvl>
+    <w:lvl w:ilvl="8" w:tplc="FFFFFFFF" w:tentative="1">
+      <w:start w:val="1"/>
+      <w:numFmt w:val="bullet"/>
+      <w:lvlText w:val=""/>
+      <w:lvlJc w:val="left"/>
+      <w:pPr>
+        <w:ind w:left="6480" w:hanging="360"/>
+      </w:pPr>
+      <w:rPr>
+        <w:rFonts w:ascii="Wingdings" w:hAnsi="Wingdings" w:hint="default"/>
+      </w:rPr>
+    </w:lvl>
+  </w:abstractNum>
+  <w:abstractNum w:abstractNumId="8" w15:restartNumberingAfterBreak="0">
     <w:nsid w:val="45AD51B3"/>
     <w:multiLevelType w:val="hybridMultilevel"/>
     <w:tmpl w:val="CF240FB4"/>
@@ -9857,7 +10730,7 @@
       </w:rPr>
     </w:lvl>
   </w:abstractNum>
-  <w:abstractNum w:abstractNumId="4" w15:restartNumberingAfterBreak="0">
+  <w:abstractNum w:abstractNumId="9" w15:restartNumberingAfterBreak="0">
     <w:nsid w:val="4C5C1D4A"/>
     <w:multiLevelType w:val="hybridMultilevel"/>
     <w:tmpl w:val="8C807EB0"/>
@@ -9970,7 +10843,7 @@
       </w:rPr>
     </w:lvl>
   </w:abstractNum>
-  <w:abstractNum w:abstractNumId="5" w15:restartNumberingAfterBreak="0">
+  <w:abstractNum w:abstractNumId="10" w15:restartNumberingAfterBreak="0">
     <w:nsid w:val="5FFA1A72"/>
     <w:multiLevelType w:val="singleLevel"/>
     <w:tmpl w:val="5FFA1A72"/>
@@ -9990,23 +10863,154 @@
       </w:rPr>
     </w:lvl>
   </w:abstractNum>
+  <w:abstractNum w:abstractNumId="11" w15:restartNumberingAfterBreak="0">
+    <w:nsid w:val="60B72789"/>
+    <w:multiLevelType w:val="hybridMultilevel"/>
+    <w:tmpl w:val="ED709B50"/>
+    <w:lvl w:ilvl="0" w:tplc="D68084EE">
+      <w:start w:val="5"/>
+      <w:numFmt w:val="bullet"/>
+      <w:lvlText w:val="-"/>
+      <w:lvlJc w:val="left"/>
+      <w:pPr>
+        <w:ind w:left="720" w:hanging="360"/>
+      </w:pPr>
+      <w:rPr>
+        <w:rFonts w:ascii="Gill Sans MT" w:eastAsia="Gill Sans MT" w:hAnsi="Gill Sans MT" w:cs="Times New Roman" w:hint="default"/>
+      </w:rPr>
+    </w:lvl>
+    <w:lvl w:ilvl="1" w:tplc="04090003" w:tentative="1">
+      <w:start w:val="1"/>
+      <w:numFmt w:val="bullet"/>
+      <w:lvlText w:val="o"/>
+      <w:lvlJc w:val="left"/>
+      <w:pPr>
+        <w:ind w:left="1440" w:hanging="360"/>
+      </w:pPr>
+      <w:rPr>
+        <w:rFonts w:ascii="Courier New" w:hAnsi="Courier New" w:hint="default"/>
+      </w:rPr>
+    </w:lvl>
+    <w:lvl w:ilvl="2" w:tplc="04090005" w:tentative="1">
+      <w:start w:val="1"/>
+      <w:numFmt w:val="bullet"/>
+      <w:lvlText w:val=""/>
+      <w:lvlJc w:val="left"/>
+      <w:pPr>
+        <w:ind w:left="2160" w:hanging="360"/>
+      </w:pPr>
+      <w:rPr>
+        <w:rFonts w:ascii="Wingdings" w:hAnsi="Wingdings" w:hint="default"/>
+      </w:rPr>
+    </w:lvl>
+    <w:lvl w:ilvl="3" w:tplc="04090001" w:tentative="1">
+      <w:start w:val="1"/>
+      <w:numFmt w:val="bullet"/>
+      <w:lvlText w:val=""/>
+      <w:lvlJc w:val="left"/>
+      <w:pPr>
+        <w:ind w:left="2880" w:hanging="360"/>
+      </w:pPr>
+      <w:rPr>
+        <w:rFonts w:ascii="Symbol" w:hAnsi="Symbol" w:hint="default"/>
+      </w:rPr>
+    </w:lvl>
+    <w:lvl w:ilvl="4" w:tplc="04090003" w:tentative="1">
+      <w:start w:val="1"/>
+      <w:numFmt w:val="bullet"/>
+      <w:lvlText w:val="o"/>
+      <w:lvlJc w:val="left"/>
+      <w:pPr>
+        <w:ind w:left="3600" w:hanging="360"/>
+      </w:pPr>
+      <w:rPr>
+        <w:rFonts w:ascii="Courier New" w:hAnsi="Courier New" w:hint="default"/>
+      </w:rPr>
+    </w:lvl>
+    <w:lvl w:ilvl="5" w:tplc="04090005" w:tentative="1">
+      <w:start w:val="1"/>
+      <w:numFmt w:val="bullet"/>
+      <w:lvlText w:val=""/>
+      <w:lvlJc w:val="left"/>
+      <w:pPr>
+        <w:ind w:left="4320" w:hanging="360"/>
+      </w:pPr>
+      <w:rPr>
+        <w:rFonts w:ascii="Wingdings" w:hAnsi="Wingdings" w:hint="default"/>
+      </w:rPr>
+    </w:lvl>
+    <w:lvl w:ilvl="6" w:tplc="04090001" w:tentative="1">
+      <w:start w:val="1"/>
+      <w:numFmt w:val="bullet"/>
+      <w:lvlText w:val=""/>
+      <w:lvlJc w:val="left"/>
+      <w:pPr>
+        <w:ind w:left="5040" w:hanging="360"/>
+      </w:pPr>
+      <w:rPr>
+        <w:rFonts w:ascii="Symbol" w:hAnsi="Symbol" w:hint="default"/>
+      </w:rPr>
+    </w:lvl>
+    <w:lvl w:ilvl="7" w:tplc="04090003" w:tentative="1">
+      <w:start w:val="1"/>
+      <w:numFmt w:val="bullet"/>
+      <w:lvlText w:val="o"/>
+      <w:lvlJc w:val="left"/>
+      <w:pPr>
+        <w:ind w:left="5760" w:hanging="360"/>
+      </w:pPr>
+      <w:rPr>
+        <w:rFonts w:ascii="Courier New" w:hAnsi="Courier New" w:hint="default"/>
+      </w:rPr>
+    </w:lvl>
+    <w:lvl w:ilvl="8" w:tplc="04090005" w:tentative="1">
+      <w:start w:val="1"/>
+      <w:numFmt w:val="bullet"/>
+      <w:lvlText w:val=""/>
+      <w:lvlJc w:val="left"/>
+      <w:pPr>
+        <w:ind w:left="6480" w:hanging="360"/>
+      </w:pPr>
+      <w:rPr>
+        <w:rFonts w:ascii="Wingdings" w:hAnsi="Wingdings" w:hint="default"/>
+      </w:rPr>
+    </w:lvl>
+  </w:abstractNum>
   <w:num w:numId="1" w16cid:durableId="1111897921">
+    <w:abstractNumId w:val="9"/>
+  </w:num>
+  <w:num w:numId="2" w16cid:durableId="921715859">
+    <w:abstractNumId w:val="3"/>
+  </w:num>
+  <w:num w:numId="3" w16cid:durableId="1207259668">
     <w:abstractNumId w:val="4"/>
   </w:num>
-  <w:num w:numId="2" w16cid:durableId="921715859">
-    <w:abstractNumId w:val="1"/>
-  </w:num>
-  <w:num w:numId="3" w16cid:durableId="1207259668">
-    <w:abstractNumId w:val="2"/>
-  </w:num>
   <w:num w:numId="4" w16cid:durableId="140706239">
-    <w:abstractNumId w:val="5"/>
+    <w:abstractNumId w:val="10"/>
   </w:num>
   <w:num w:numId="5" w16cid:durableId="1379666355">
     <w:abstractNumId w:val="0"/>
   </w:num>
   <w:num w:numId="6" w16cid:durableId="1913928729">
-    <w:abstractNumId w:val="3"/>
+    <w:abstractNumId w:val="8"/>
+  </w:num>
+  <w:num w:numId="7" w16cid:durableId="1444306487">
+    <w:abstractNumId w:val="5"/>
+  </w:num>
+  <w:num w:numId="8" w16cid:durableId="2105303193">
+    <w:abstractNumId w:val="2"/>
+  </w:num>
+  <w:num w:numId="9" w16cid:durableId="1301763211">
+    <w:abstractNumId w:val="7"/>
+  </w:num>
+  <w:num w:numId="10" w16cid:durableId="524562034">
+    <w:abstractNumId w:val="6"/>
+  </w:num>
+  <w:num w:numId="11" w16cid:durableId="1300649061">
+    <w:abstractNumId w:val="11"/>
+  </w:num>
+  <w:num w:numId="12" w16cid:durableId="419182665">
+    <w:abstractNumId w:val="1"/>
   </w:num>
 </w:numbering>
 </file>
@@ -11044,12 +12048,12 @@
     <w:pitch w:val="variable"/>
     <w:sig w:usb0="E0002EFF" w:usb1="C000785B" w:usb2="00000009" w:usb3="00000000" w:csb0="000001FF" w:csb1="00000000"/>
   </w:font>
-  <w:font w:name="Symbol">
-    <w:panose1 w:val="05050102010706020507"/>
-    <w:charset w:val="02"/>
-    <w:family w:val="decorative"/>
+  <w:font w:name="Gill Sans MT">
+    <w:panose1 w:val="020B0502020104020203"/>
+    <w:charset w:val="4D"/>
+    <w:family w:val="swiss"/>
     <w:pitch w:val="variable"/>
-    <w:sig w:usb0="00000000" w:usb1="10000000" w:usb2="00000000" w:usb3="00000000" w:csb0="80000000" w:csb1="00000000"/>
+    <w:sig w:usb0="00000003" w:usb1="00000000" w:usb2="00000000" w:usb3="00000000" w:csb0="00000003" w:csb1="00000000"/>
   </w:font>
   <w:font w:name="Courier New">
     <w:panose1 w:val="02070309020205020404"/>
@@ -11065,12 +12069,12 @@
     <w:pitch w:val="variable"/>
     <w:sig w:usb0="00000003" w:usb1="00000000" w:usb2="00000000" w:usb3="00000000" w:csb0="80000001" w:csb1="00000000"/>
   </w:font>
-  <w:font w:name="Gill Sans MT">
-    <w:panose1 w:val="020B0502020104020203"/>
-    <w:charset w:val="4D"/>
-    <w:family w:val="swiss"/>
+  <w:font w:name="Symbol">
+    <w:panose1 w:val="05050102010706020507"/>
+    <w:charset w:val="02"/>
+    <w:family w:val="decorative"/>
     <w:pitch w:val="variable"/>
-    <w:sig w:usb0="00000003" w:usb1="00000000" w:usb2="00000000" w:usb3="00000000" w:csb0="00000003" w:csb1="00000000"/>
+    <w:sig w:usb0="00000000" w:usb1="10000000" w:usb2="00000000" w:usb3="00000000" w:csb0="80000000" w:csb1="00000000"/>
   </w:font>
   <w:font w:name="Aptos">
     <w:panose1 w:val="020B0004020202020204"/>
@@ -11124,6 +12128,7 @@
     <w:rsid w:val="00425EDB"/>
     <w:rsid w:val="0045715B"/>
     <w:rsid w:val="00475F2C"/>
+    <w:rsid w:val="004856D4"/>
     <w:rsid w:val="004C7B6F"/>
     <w:rsid w:val="00522FA4"/>
     <w:rsid w:val="005C0BE5"/>
@@ -11132,6 +12137,7 @@
     <w:rsid w:val="00727107"/>
     <w:rsid w:val="00783C27"/>
     <w:rsid w:val="007D0AC6"/>
+    <w:rsid w:val="008155A7"/>
     <w:rsid w:val="008504BC"/>
     <w:rsid w:val="008548F3"/>
     <w:rsid w:val="008E2474"/>

</xml_diff>